<commit_message>
Fix object/subject/goal definitions in diploma and practice report
</commit_message>
<xml_diff>
--- a/docs/диплом.docx
+++ b/docs/диплом.docx
@@ -155,6 +155,54 @@
     </w:p>
     <w:p>
       <w:pPr>
+        <w:spacing w:before="0" w:after="120"/>
+        <w:ind w:firstLine="0"/>
+      </w:pPr>
+      <w:r>
+        <w:rPr>
+          <w:rFonts w:ascii="Times New Roman" w:hAnsi="Times New Roman" w:cs="Times New Roman"/>
+          <w:rFonts w:ascii="Times New Roman" w:hAnsi="Times New Roman"/>
+          <w:b/>
+          <w:sz w:val="28"/>
+        </w:rPr>
+        <w:t>Объект исследования</w:t>
+      </w:r>
+      <w:r>
+        <w:rPr>
+          <w:rFonts w:ascii="Times New Roman" w:hAnsi="Times New Roman" w:cs="Times New Roman"/>
+          <w:rFonts w:ascii="Times New Roman" w:hAnsi="Times New Roman"/>
+          <w:b w:val="0"/>
+          <w:sz w:val="28"/>
+        </w:rPr>
+        <w:t xml:space="preserve"> — система метаданных научных публикаций и журналов, представленных в открытых библиографических каталогах.</w:t>
+      </w:r>
+    </w:p>
+    <w:p>
+      <w:pPr>
+        <w:spacing w:before="0" w:after="120"/>
+        <w:ind w:firstLine="0"/>
+      </w:pPr>
+      <w:r>
+        <w:rPr>
+          <w:rFonts w:ascii="Times New Roman" w:hAnsi="Times New Roman" w:cs="Times New Roman"/>
+          <w:rFonts w:ascii="Times New Roman" w:hAnsi="Times New Roman"/>
+          <w:b/>
+          <w:sz w:val="28"/>
+        </w:rPr>
+        <w:t>Предмет исследования</w:t>
+      </w:r>
+      <w:r>
+        <w:rPr>
+          <w:rFonts w:ascii="Times New Roman" w:hAnsi="Times New Roman" w:cs="Times New Roman"/>
+          <w:rFonts w:ascii="Times New Roman" w:hAnsi="Times New Roman"/>
+          <w:b w:val="0"/>
+          <w:sz w:val="28"/>
+        </w:rPr>
+        <w:t xml:space="preserve"> — методы интерактивной визуализации метаданных научных публикаций: географической карты аффилиаций авторов и графа связей между публикациями, авторами, журналами и организациями.</w:t>
+      </w:r>
+    </w:p>
+    <w:p>
+      <w:pPr>
         <w:spacing w:after="0"/>
         <w:ind w:firstLine="709"/>
         <w:jc w:val="both"/>
@@ -265,12 +313,13 @@
       </w:pPr>
       <w:r>
         <w:rPr>
+          <w:rFonts w:ascii="Times New Roman" w:hAnsi="Times New Roman" w:cs="Times New Roman"/>
           <w:rFonts w:ascii="Times New Roman" w:hAnsi="Times New Roman"/>
           <w:b w:val="0"/>
           <w:i w:val="0"/>
           <w:sz w:val="28"/>
         </w:rPr>
-        <w:t>Объект исследования — метаданные научных публикаций и журналов: названия, авторы, годы, аффилиации, тематические классификаторы, ключевые слова, DOI. Данные получены из OpenAlex — бесплатного каталога с более чем 250 миллионами работ. Полные тексты статей не используются — структурированных описаний достаточно для выявления связей между участниками научного процесса.</w:t>
+        <w:t>Данные получены из OpenAlex — бесплатного каталога с более чем 250 миллионами работ. Для каждой публикации используются метаданные: название, авторы, год, аффилиации, тематические классификаторы, ключевые слова, DOI. Полные тексты статей не используются — структурированных описаний достаточно для выявления связей между участниками научного процесса.</w:t>
       </w:r>
     </w:p>
     <w:p>

</xml_diff>

<commit_message>
Add comparative study of existing tools as Chapter I in diploma
</commit_message>
<xml_diff>
--- a/docs/диплом.docx
+++ b/docs/диплом.docx
@@ -444,6 +444,1791 @@
     <w:p/>
     <w:p>
       <w:pPr>
+        <w:spacing w:before="280" w:after="160"/>
+        <w:ind w:firstLine="0"/>
+        <w:jc w:val="center"/>
+      </w:pPr>
+      <w:r>
+        <w:rPr>
+          <w:rFonts w:ascii="Times New Roman" w:hAnsi="Times New Roman" w:cs="Times New Roman"/>
+          <w:rFonts w:ascii="Times New Roman" w:hAnsi="Times New Roman"/>
+          <w:b/>
+          <w:sz w:val="28"/>
+        </w:rPr>
+        <w:t>ГЛАВА I. ОБЗОР СУЩЕСТВУЮЩИХ РЕШЕНИЙ</w:t>
+      </w:r>
+    </w:p>
+    <w:p>
+      <w:pPr>
+        <w:spacing w:before="0" w:after="120"/>
+        <w:ind w:firstLine="709"/>
+        <w:jc w:val="both"/>
+      </w:pPr>
+      <w:r>
+        <w:rPr>
+          <w:rFonts w:ascii="Times New Roman" w:hAnsi="Times New Roman" w:cs="Times New Roman"/>
+          <w:rFonts w:ascii="Times New Roman" w:hAnsi="Times New Roman"/>
+          <w:b w:val="0"/>
+          <w:sz w:val="28"/>
+        </w:rPr>
+        <w:t>В области библиометрического анализа и визуализации научных публикаций существует ряд инструментов, решающих схожие задачи. Ниже приведён обзор шести наиболее распространённых систем с анализом их возможностей и ограничений.</w:t>
+      </w:r>
+    </w:p>
+    <w:p>
+      <w:pPr>
+        <w:spacing w:before="280" w:after="160"/>
+        <w:ind w:firstLine="0"/>
+      </w:pPr>
+      <w:r>
+        <w:rPr>
+          <w:rFonts w:ascii="Times New Roman" w:hAnsi="Times New Roman" w:cs="Times New Roman"/>
+          <w:rFonts w:ascii="Times New Roman" w:hAnsi="Times New Roman"/>
+          <w:b/>
+          <w:sz w:val="28"/>
+        </w:rPr>
+        <w:t>1.1. VOSviewer</w:t>
+      </w:r>
+    </w:p>
+    <w:p>
+      <w:pPr>
+        <w:spacing w:before="0" w:after="120"/>
+        <w:ind w:firstLine="709"/>
+        <w:jc w:val="both"/>
+      </w:pPr>
+      <w:r>
+        <w:rPr>
+          <w:rFonts w:ascii="Times New Roman" w:hAnsi="Times New Roman" w:cs="Times New Roman"/>
+          <w:rFonts w:ascii="Times New Roman" w:hAnsi="Times New Roman"/>
+          <w:b w:val="0"/>
+          <w:sz w:val="28"/>
+        </w:rPr>
+        <w:t>VOSviewer — бесплатная программа для построения и визуализации библиометрических сетей, разработанная Лейденским университетом (Нидерланды). Распространяется как настольное приложение для Windows, macOS и Linux.</w:t>
+      </w:r>
+    </w:p>
+    <w:p>
+      <w:pPr>
+        <w:spacing w:before="0" w:after="120"/>
+        <w:ind w:firstLine="709"/>
+        <w:jc w:val="both"/>
+      </w:pPr>
+      <w:r>
+        <w:rPr>
+          <w:rFonts w:ascii="Times New Roman" w:hAnsi="Times New Roman" w:cs="Times New Roman"/>
+          <w:rFonts w:ascii="Times New Roman" w:hAnsi="Times New Roman"/>
+          <w:b w:val="0"/>
+          <w:sz w:val="28"/>
+        </w:rPr>
+        <w:t>Визуализации: сети соавторства, совместного цитирования, библиографического сочетания, совместного употребления ключевых слов; карты плотности и наложения. Поддерживает отображение географии сотрудничества по странам.</w:t>
+      </w:r>
+    </w:p>
+    <w:p>
+      <w:pPr>
+        <w:spacing w:before="0" w:after="120"/>
+        <w:ind w:firstLine="709"/>
+        <w:jc w:val="both"/>
+      </w:pPr>
+      <w:r>
+        <w:rPr>
+          <w:rFonts w:ascii="Times New Roman" w:hAnsi="Times New Roman" w:cs="Times New Roman"/>
+          <w:rFonts w:ascii="Times New Roman" w:hAnsi="Times New Roman"/>
+          <w:b w:val="0"/>
+          <w:sz w:val="28"/>
+        </w:rPr>
+        <w:t>Источники данных: Web of Science, Scopus, PubMed, Dimensions, Semantic Scholar. Данные необходимо подготовить и экспортировать в поддерживаемом формате заранее — встроенного поиска нет.</w:t>
+      </w:r>
+    </w:p>
+    <w:p>
+      <w:pPr>
+        <w:spacing w:before="0" w:after="120"/>
+        <w:ind w:firstLine="709"/>
+        <w:jc w:val="both"/>
+      </w:pPr>
+      <w:r>
+        <w:rPr>
+          <w:rFonts w:ascii="Times New Roman" w:hAnsi="Times New Roman" w:cs="Times New Roman"/>
+          <w:rFonts w:ascii="Times New Roman" w:hAnsi="Times New Roman"/>
+          <w:b w:val="0"/>
+          <w:sz w:val="28"/>
+        </w:rPr>
+        <w:t>Ограничения: отсутствует алгоритм поиска похожих статей; фильтрация ограничена — применяется к уже загруженному набору; установка на компьютер обязательна; веб-версия (VOSviewer Online) требует сохранения данных в облаке.</w:t>
+      </w:r>
+    </w:p>
+    <w:p>
+      <w:pPr>
+        <w:spacing w:before="280" w:after="160"/>
+        <w:ind w:firstLine="0"/>
+      </w:pPr>
+      <w:r>
+        <w:rPr>
+          <w:rFonts w:ascii="Times New Roman" w:hAnsi="Times New Roman" w:cs="Times New Roman"/>
+          <w:rFonts w:ascii="Times New Roman" w:hAnsi="Times New Roman"/>
+          <w:b/>
+          <w:sz w:val="28"/>
+        </w:rPr>
+        <w:t>1.2. CiteSpace</w:t>
+      </w:r>
+    </w:p>
+    <w:p>
+      <w:pPr>
+        <w:spacing w:before="0" w:after="120"/>
+        <w:ind w:firstLine="709"/>
+        <w:jc w:val="both"/>
+      </w:pPr>
+      <w:r>
+        <w:rPr>
+          <w:rFonts w:ascii="Times New Roman" w:hAnsi="Times New Roman" w:cs="Times New Roman"/>
+          <w:rFonts w:ascii="Times New Roman" w:hAnsi="Times New Roman"/>
+          <w:b w:val="0"/>
+          <w:sz w:val="28"/>
+        </w:rPr>
+        <w:t>CiteSpace — бесплатное Java-приложение для анализа тенденций и структурных паттернов в научной литературе, разработано в Университете Дрексела (США).</w:t>
+      </w:r>
+    </w:p>
+    <w:p>
+      <w:pPr>
+        <w:spacing w:before="0" w:after="120"/>
+        <w:ind w:firstLine="709"/>
+        <w:jc w:val="both"/>
+      </w:pPr>
+      <w:r>
+        <w:rPr>
+          <w:rFonts w:ascii="Times New Roman" w:hAnsi="Times New Roman" w:cs="Times New Roman"/>
+          <w:rFonts w:ascii="Times New Roman" w:hAnsi="Times New Roman"/>
+          <w:b w:val="0"/>
+          <w:sz w:val="28"/>
+        </w:rPr>
+        <w:t>Визуализации: сети цитирования с выделением всплесков активности (burst detection), кластерная раскладка с автоматическими метками, карты географического сотрудничества по странам (экспорт в KML для Google Earth).</w:t>
+      </w:r>
+    </w:p>
+    <w:p>
+      <w:pPr>
+        <w:spacing w:before="0" w:after="120"/>
+        <w:ind w:firstLine="709"/>
+        <w:jc w:val="both"/>
+      </w:pPr>
+      <w:r>
+        <w:rPr>
+          <w:rFonts w:ascii="Times New Roman" w:hAnsi="Times New Roman" w:cs="Times New Roman"/>
+          <w:rFonts w:ascii="Times New Roman" w:hAnsi="Times New Roman"/>
+          <w:b w:val="0"/>
+          <w:sz w:val="28"/>
+        </w:rPr>
+        <w:t>Источники данных: Web of Science, Scopus, Dimensions, Lens.org, PubMed.</w:t>
+      </w:r>
+    </w:p>
+    <w:p>
+      <w:pPr>
+        <w:spacing w:before="0" w:after="120"/>
+        <w:ind w:firstLine="709"/>
+        <w:jc w:val="both"/>
+      </w:pPr>
+      <w:r>
+        <w:rPr>
+          <w:rFonts w:ascii="Times New Roman" w:hAnsi="Times New Roman" w:cs="Times New Roman"/>
+          <w:rFonts w:ascii="Times New Roman" w:hAnsi="Times New Roman"/>
+          <w:b w:val="0"/>
+          <w:sz w:val="28"/>
+        </w:rPr>
+        <w:t>Ограничения: требует установки Java Runtime Environment; нет алгоритма похожих статей; интерфейс перегружен настройками и рассчитан на специалистов в области библиометрии; отсутствует веб-версия.</w:t>
+      </w:r>
+    </w:p>
+    <w:p>
+      <w:pPr>
+        <w:spacing w:before="280" w:after="160"/>
+        <w:ind w:firstLine="0"/>
+      </w:pPr>
+      <w:r>
+        <w:rPr>
+          <w:rFonts w:ascii="Times New Roman" w:hAnsi="Times New Roman" w:cs="Times New Roman"/>
+          <w:rFonts w:ascii="Times New Roman" w:hAnsi="Times New Roman"/>
+          <w:b/>
+          <w:sz w:val="28"/>
+        </w:rPr>
+        <w:t>1.3. Connected Papers</w:t>
+      </w:r>
+    </w:p>
+    <w:p>
+      <w:pPr>
+        <w:spacing w:before="0" w:after="120"/>
+        <w:ind w:firstLine="709"/>
+        <w:jc w:val="both"/>
+      </w:pPr>
+      <w:r>
+        <w:rPr>
+          <w:rFonts w:ascii="Times New Roman" w:hAnsi="Times New Roman" w:cs="Times New Roman"/>
+          <w:rFonts w:ascii="Times New Roman" w:hAnsi="Times New Roman"/>
+          <w:b w:val="0"/>
+          <w:sz w:val="28"/>
+        </w:rPr>
+        <w:t>Connected Papers — веб-сервис для визуального исследования тематических связей между статьями. Работает в браузере без установки. Базовый доступ бесплатный (5 графов в месяц), расширенный — от 6 долларов в месяц.</w:t>
+      </w:r>
+    </w:p>
+    <w:p>
+      <w:pPr>
+        <w:spacing w:before="0" w:after="120"/>
+        <w:ind w:firstLine="709"/>
+        <w:jc w:val="both"/>
+      </w:pPr>
+      <w:r>
+        <w:rPr>
+          <w:rFonts w:ascii="Times New Roman" w:hAnsi="Times New Roman" w:cs="Times New Roman"/>
+          <w:rFonts w:ascii="Times New Roman" w:hAnsi="Times New Roman"/>
+          <w:b w:val="0"/>
+          <w:sz w:val="28"/>
+        </w:rPr>
+        <w:t>Визуализации: граф похожих статей, построенный на основе совместного цитирования и библиографического сочетания; отдельные режимы предшественников и производных работ.</w:t>
+      </w:r>
+    </w:p>
+    <w:p>
+      <w:pPr>
+        <w:spacing w:before="0" w:after="120"/>
+        <w:ind w:firstLine="709"/>
+        <w:jc w:val="both"/>
+      </w:pPr>
+      <w:r>
+        <w:rPr>
+          <w:rFonts w:ascii="Times New Roman" w:hAnsi="Times New Roman" w:cs="Times New Roman"/>
+          <w:rFonts w:ascii="Times New Roman" w:hAnsi="Times New Roman"/>
+          <w:b w:val="0"/>
+          <w:sz w:val="28"/>
+        </w:rPr>
+        <w:t>Алгоритм схожести: учитывает совместное цитирование и сближение ссылок, приоритет отдаётся статьям близкого года публикации. Каждый граф строится вокруг одной выбранной статьи и охватывает до ~50 000 работ корпуса Semantic Scholar.</w:t>
+      </w:r>
+    </w:p>
+    <w:p>
+      <w:pPr>
+        <w:spacing w:before="0" w:after="120"/>
+        <w:ind w:firstLine="709"/>
+        <w:jc w:val="both"/>
+      </w:pPr>
+      <w:r>
+        <w:rPr>
+          <w:rFonts w:ascii="Times New Roman" w:hAnsi="Times New Roman" w:cs="Times New Roman"/>
+          <w:rFonts w:ascii="Times New Roman" w:hAnsi="Times New Roman"/>
+          <w:b w:val="0"/>
+          <w:sz w:val="28"/>
+        </w:rPr>
+        <w:t>Ограничения: нет географической карты; одновременно анализируется только одна статья; нет фильтрации по авторам, аффилиациям или журналам; платная подписка для активного использования.</w:t>
+      </w:r>
+    </w:p>
+    <w:p>
+      <w:pPr>
+        <w:spacing w:before="280" w:after="160"/>
+        <w:ind w:firstLine="0"/>
+      </w:pPr>
+      <w:r>
+        <w:rPr>
+          <w:rFonts w:ascii="Times New Roman" w:hAnsi="Times New Roman" w:cs="Times New Roman"/>
+          <w:rFonts w:ascii="Times New Roman" w:hAnsi="Times New Roman"/>
+          <w:b/>
+          <w:sz w:val="28"/>
+        </w:rPr>
+        <w:t>1.4. Bibliometrix / Biblioshiny</w:t>
+      </w:r>
+    </w:p>
+    <w:p>
+      <w:pPr>
+        <w:spacing w:before="0" w:after="120"/>
+        <w:ind w:firstLine="709"/>
+        <w:jc w:val="both"/>
+      </w:pPr>
+      <w:r>
+        <w:rPr>
+          <w:rFonts w:ascii="Times New Roman" w:hAnsi="Times New Roman" w:cs="Times New Roman"/>
+          <w:rFonts w:ascii="Times New Roman" w:hAnsi="Times New Roman"/>
+          <w:b w:val="0"/>
+          <w:sz w:val="28"/>
+        </w:rPr>
+        <w:t>Bibliometrix — пакет для языка R с открытым исходным кодом (лицензия MIT), предназначенный для количественного анализа научной литературы. Biblioshiny — его веб-интерфейс на основе фреймворка Shiny, запускаемый локально.</w:t>
+      </w:r>
+    </w:p>
+    <w:p>
+      <w:pPr>
+        <w:spacing w:before="0" w:after="120"/>
+        <w:ind w:firstLine="709"/>
+        <w:jc w:val="both"/>
+      </w:pPr>
+      <w:r>
+        <w:rPr>
+          <w:rFonts w:ascii="Times New Roman" w:hAnsi="Times New Roman" w:cs="Times New Roman"/>
+          <w:rFonts w:ascii="Times New Roman" w:hAnsi="Times New Roman"/>
+          <w:b w:val="0"/>
+          <w:sz w:val="28"/>
+        </w:rPr>
+        <w:t>Визуализации: карты соавторства по странам, сети ключевых слов, тематические карты, анализ продуктивности авторов, плотностные карты аффилиаций.</w:t>
+      </w:r>
+    </w:p>
+    <w:p>
+      <w:pPr>
+        <w:spacing w:before="0" w:after="120"/>
+        <w:ind w:firstLine="709"/>
+        <w:jc w:val="both"/>
+      </w:pPr>
+      <w:r>
+        <w:rPr>
+          <w:rFonts w:ascii="Times New Roman" w:hAnsi="Times New Roman" w:cs="Times New Roman"/>
+          <w:rFonts w:ascii="Times New Roman" w:hAnsi="Times New Roman"/>
+          <w:b w:val="0"/>
+          <w:sz w:val="28"/>
+        </w:rPr>
+        <w:t>Источники данных: Web of Science, Scopus, PubMed, OpenAlex (прямая интеграция через API), Lens.org, Dimensions.</w:t>
+      </w:r>
+    </w:p>
+    <w:p>
+      <w:pPr>
+        <w:spacing w:before="0" w:after="120"/>
+        <w:ind w:firstLine="709"/>
+        <w:jc w:val="both"/>
+      </w:pPr>
+      <w:r>
+        <w:rPr>
+          <w:rFonts w:ascii="Times New Roman" w:hAnsi="Times New Roman" w:cs="Times New Roman"/>
+          <w:rFonts w:ascii="Times New Roman" w:hAnsi="Times New Roman"/>
+          <w:b w:val="0"/>
+          <w:sz w:val="28"/>
+        </w:rPr>
+        <w:t>Ограничения: требует установки R и запуска локального Shiny-сервера; нет поиска похожих статей; порог вхождения высок для пользователей без опыта программирования.</w:t>
+      </w:r>
+    </w:p>
+    <w:p>
+      <w:pPr>
+        <w:spacing w:before="280" w:after="160"/>
+        <w:ind w:firstLine="0"/>
+      </w:pPr>
+      <w:r>
+        <w:rPr>
+          <w:rFonts w:ascii="Times New Roman" w:hAnsi="Times New Roman" w:cs="Times New Roman"/>
+          <w:rFonts w:ascii="Times New Roman" w:hAnsi="Times New Roman"/>
+          <w:b/>
+          <w:sz w:val="28"/>
+        </w:rPr>
+        <w:t>1.5. Gephi</w:t>
+      </w:r>
+    </w:p>
+    <w:p>
+      <w:pPr>
+        <w:spacing w:before="0" w:after="120"/>
+        <w:ind w:firstLine="709"/>
+        <w:jc w:val="both"/>
+      </w:pPr>
+      <w:r>
+        <w:rPr>
+          <w:rFonts w:ascii="Times New Roman" w:hAnsi="Times New Roman" w:cs="Times New Roman"/>
+          <w:rFonts w:ascii="Times New Roman" w:hAnsi="Times New Roman"/>
+          <w:b w:val="0"/>
+          <w:sz w:val="28"/>
+        </w:rPr>
+        <w:t>Gephi — бесплатная программа с открытым кодом (лицензия GPL) для визуализации и анализа больших сетей. Версия 0.11 (май 2025 года) поддерживает до 10 миллионов элементов.</w:t>
+      </w:r>
+    </w:p>
+    <w:p>
+      <w:pPr>
+        <w:spacing w:before="0" w:after="120"/>
+        <w:ind w:firstLine="709"/>
+        <w:jc w:val="both"/>
+      </w:pPr>
+      <w:r>
+        <w:rPr>
+          <w:rFonts w:ascii="Times New Roman" w:hAnsi="Times New Roman" w:cs="Times New Roman"/>
+          <w:rFonts w:ascii="Times New Roman" w:hAnsi="Times New Roman"/>
+          <w:b w:val="0"/>
+          <w:sz w:val="28"/>
+        </w:rPr>
+        <w:t>Визуализации: сетевые графы с настраиваемой раскладкой (force-directed, circular), визуализация центральности, кластеризация и модульность. Gephi Lite — ограниченная веб-версия.</w:t>
+      </w:r>
+    </w:p>
+    <w:p>
+      <w:pPr>
+        <w:spacing w:before="0" w:after="120"/>
+        <w:ind w:firstLine="709"/>
+        <w:jc w:val="both"/>
+      </w:pPr>
+      <w:r>
+        <w:rPr>
+          <w:rFonts w:ascii="Times New Roman" w:hAnsi="Times New Roman" w:cs="Times New Roman"/>
+          <w:rFonts w:ascii="Times New Roman" w:hAnsi="Times New Roman"/>
+          <w:b w:val="0"/>
+          <w:sz w:val="28"/>
+        </w:rPr>
+        <w:t>Ограничения: данные необходимо предварительно подготовить в форматах GEXF, GraphML, CSV; нет встроенного подключения к источникам научных данных; нет географической карты; нет алгоритма схожести статей.</w:t>
+      </w:r>
+    </w:p>
+    <w:p>
+      <w:pPr>
+        <w:spacing w:before="280" w:after="160"/>
+        <w:ind w:firstLine="0"/>
+      </w:pPr>
+      <w:r>
+        <w:rPr>
+          <w:rFonts w:ascii="Times New Roman" w:hAnsi="Times New Roman" w:cs="Times New Roman"/>
+          <w:rFonts w:ascii="Times New Roman" w:hAnsi="Times New Roman"/>
+          <w:b/>
+          <w:sz w:val="28"/>
+        </w:rPr>
+        <w:t>1.6. Lens.org</w:t>
+      </w:r>
+    </w:p>
+    <w:p>
+      <w:pPr>
+        <w:spacing w:before="0" w:after="120"/>
+        <w:ind w:firstLine="709"/>
+        <w:jc w:val="both"/>
+      </w:pPr>
+      <w:r>
+        <w:rPr>
+          <w:rFonts w:ascii="Times New Roman" w:hAnsi="Times New Roman" w:cs="Times New Roman"/>
+          <w:rFonts w:ascii="Times New Roman" w:hAnsi="Times New Roman"/>
+          <w:b w:val="0"/>
+          <w:sz w:val="28"/>
+        </w:rPr>
+        <w:t>Lens.org — бесплатный веб-сервис для поиска и анализа научных публикаций и патентов. Содержит более 225 миллионов научных работ. Работает в браузере без регистрации.</w:t>
+      </w:r>
+    </w:p>
+    <w:p>
+      <w:pPr>
+        <w:spacing w:before="0" w:after="120"/>
+        <w:ind w:firstLine="709"/>
+        <w:jc w:val="both"/>
+      </w:pPr>
+      <w:r>
+        <w:rPr>
+          <w:rFonts w:ascii="Times New Roman" w:hAnsi="Times New Roman" w:cs="Times New Roman"/>
+          <w:rFonts w:ascii="Times New Roman" w:hAnsi="Times New Roman"/>
+          <w:b w:val="0"/>
+          <w:sz w:val="28"/>
+        </w:rPr>
+        <w:t>Визуализации: распределение публикаций по времени, топ-институтов, географическая карта по странам, диаграммы по тематикам и авторам.</w:t>
+      </w:r>
+    </w:p>
+    <w:p>
+      <w:pPr>
+        <w:spacing w:before="0" w:after="120"/>
+        <w:ind w:firstLine="709"/>
+        <w:jc w:val="both"/>
+      </w:pPr>
+      <w:r>
+        <w:rPr>
+          <w:rFonts w:ascii="Times New Roman" w:hAnsi="Times New Roman" w:cs="Times New Roman"/>
+          <w:rFonts w:ascii="Times New Roman" w:hAnsi="Times New Roman"/>
+          <w:b w:val="0"/>
+          <w:sz w:val="28"/>
+        </w:rPr>
+        <w:t>Фильтрация: по году, автору, журналу, теме, типу доступа. Зарегистрированные пользователи могут экспортировать до 50 000 записей.</w:t>
+      </w:r>
+    </w:p>
+    <w:p>
+      <w:pPr>
+        <w:spacing w:before="0" w:after="120"/>
+        <w:ind w:firstLine="709"/>
+        <w:jc w:val="both"/>
+      </w:pPr>
+      <w:r>
+        <w:rPr>
+          <w:rFonts w:ascii="Times New Roman" w:hAnsi="Times New Roman" w:cs="Times New Roman"/>
+          <w:rFonts w:ascii="Times New Roman" w:hAnsi="Times New Roman"/>
+          <w:b w:val="0"/>
+          <w:sz w:val="28"/>
+        </w:rPr>
+        <w:t>Ограничения: нет алгоритма поиска похожих статей; нет графа связей между публикациями и авторами; инструменты визуализации ограничены агрегированными диаграммами.</w:t>
+      </w:r>
+    </w:p>
+    <w:p>
+      <w:pPr>
+        <w:spacing w:before="280" w:after="160"/>
+        <w:ind w:firstLine="0"/>
+      </w:pPr>
+      <w:r>
+        <w:rPr>
+          <w:rFonts w:ascii="Times New Roman" w:hAnsi="Times New Roman" w:cs="Times New Roman"/>
+          <w:rFonts w:ascii="Times New Roman" w:hAnsi="Times New Roman"/>
+          <w:b/>
+          <w:sz w:val="28"/>
+        </w:rPr>
+        <w:t>1.7. Сравнительная таблица</w:t>
+      </w:r>
+    </w:p>
+    <w:p>
+      <w:pPr>
+        <w:spacing w:before="0" w:after="120"/>
+        <w:ind w:firstLine="709"/>
+        <w:jc w:val="both"/>
+      </w:pPr>
+      <w:r>
+        <w:rPr>
+          <w:rFonts w:ascii="Times New Roman" w:hAnsi="Times New Roman" w:cs="Times New Roman"/>
+          <w:rFonts w:ascii="Times New Roman" w:hAnsi="Times New Roman"/>
+          <w:b w:val="0"/>
+          <w:sz w:val="28"/>
+        </w:rPr>
+        <w:t>Результаты сравнения сведены в таблицу 1.</w:t>
+      </w:r>
+    </w:p>
+    <w:tbl>
+      <w:tblPr>
+        <w:tblStyle w:val="TableGrid"/>
+        <w:tblW w:type="auto" w:w="0"/>
+        <w:tblLook w:firstColumn="1" w:firstRow="1" w:lastColumn="0" w:lastRow="0" w:noHBand="0" w:noVBand="1" w:val="04A0"/>
+      </w:tblPr>
+      <w:tblGrid>
+        <w:gridCol w:w="1080"/>
+        <w:gridCol w:w="1080"/>
+        <w:gridCol w:w="1080"/>
+        <w:gridCol w:w="1080"/>
+        <w:gridCol w:w="1080"/>
+        <w:gridCol w:w="1080"/>
+        <w:gridCol w:w="1080"/>
+        <w:gridCol w:w="1080"/>
+      </w:tblGrid>
+      <w:tr>
+        <w:tc>
+          <w:tcPr>
+            <w:tcW w:type="dxa" w:w="1080"/>
+          </w:tcPr>
+          <w:p>
+            <w:r>
+              <w:rPr>
+                <w:rFonts w:ascii="Times New Roman" w:hAnsi="Times New Roman" w:cs="Times New Roman"/>
+                <w:rFonts w:ascii="Times New Roman" w:hAnsi="Times New Roman"/>
+                <w:b/>
+                <w:sz w:val="18"/>
+              </w:rPr>
+              <w:t>Характеристика</w:t>
+            </w:r>
+          </w:p>
+        </w:tc>
+        <w:tc>
+          <w:tcPr>
+            <w:tcW w:type="dxa" w:w="1080"/>
+          </w:tcPr>
+          <w:p>
+            <w:r>
+              <w:rPr>
+                <w:rFonts w:ascii="Times New Roman" w:hAnsi="Times New Roman" w:cs="Times New Roman"/>
+                <w:rFonts w:ascii="Times New Roman" w:hAnsi="Times New Roman"/>
+                <w:b/>
+                <w:sz w:val="18"/>
+              </w:rPr>
+              <w:t>VOSviewer</w:t>
+            </w:r>
+          </w:p>
+        </w:tc>
+        <w:tc>
+          <w:tcPr>
+            <w:tcW w:type="dxa" w:w="1080"/>
+          </w:tcPr>
+          <w:p>
+            <w:r>
+              <w:rPr>
+                <w:rFonts w:ascii="Times New Roman" w:hAnsi="Times New Roman" w:cs="Times New Roman"/>
+                <w:rFonts w:ascii="Times New Roman" w:hAnsi="Times New Roman"/>
+                <w:b/>
+                <w:sz w:val="18"/>
+              </w:rPr>
+              <w:t>CiteSpace</w:t>
+            </w:r>
+          </w:p>
+        </w:tc>
+        <w:tc>
+          <w:tcPr>
+            <w:tcW w:type="dxa" w:w="1080"/>
+          </w:tcPr>
+          <w:p>
+            <w:r>
+              <w:rPr>
+                <w:rFonts w:ascii="Times New Roman" w:hAnsi="Times New Roman" w:cs="Times New Roman"/>
+                <w:rFonts w:ascii="Times New Roman" w:hAnsi="Times New Roman"/>
+                <w:b/>
+                <w:sz w:val="18"/>
+              </w:rPr>
+              <w:t>Connected Papers</w:t>
+            </w:r>
+          </w:p>
+        </w:tc>
+        <w:tc>
+          <w:tcPr>
+            <w:tcW w:type="dxa" w:w="1080"/>
+          </w:tcPr>
+          <w:p>
+            <w:r>
+              <w:rPr>
+                <w:rFonts w:ascii="Times New Roman" w:hAnsi="Times New Roman" w:cs="Times New Roman"/>
+                <w:rFonts w:ascii="Times New Roman" w:hAnsi="Times New Roman"/>
+                <w:b/>
+                <w:sz w:val="18"/>
+              </w:rPr>
+              <w:t>Bibliometrix</w:t>
+            </w:r>
+          </w:p>
+        </w:tc>
+        <w:tc>
+          <w:tcPr>
+            <w:tcW w:type="dxa" w:w="1080"/>
+          </w:tcPr>
+          <w:p>
+            <w:r>
+              <w:rPr>
+                <w:rFonts w:ascii="Times New Roman" w:hAnsi="Times New Roman" w:cs="Times New Roman"/>
+                <w:rFonts w:ascii="Times New Roman" w:hAnsi="Times New Roman"/>
+                <w:b/>
+                <w:sz w:val="18"/>
+              </w:rPr>
+              <w:t>Gephi</w:t>
+            </w:r>
+          </w:p>
+        </w:tc>
+        <w:tc>
+          <w:tcPr>
+            <w:tcW w:type="dxa" w:w="1080"/>
+          </w:tcPr>
+          <w:p>
+            <w:r>
+              <w:rPr>
+                <w:rFonts w:ascii="Times New Roman" w:hAnsi="Times New Roman" w:cs="Times New Roman"/>
+                <w:rFonts w:ascii="Times New Roman" w:hAnsi="Times New Roman"/>
+                <w:b/>
+                <w:sz w:val="18"/>
+              </w:rPr>
+              <w:t>Lens.org</w:t>
+            </w:r>
+          </w:p>
+        </w:tc>
+        <w:tc>
+          <w:tcPr>
+            <w:tcW w:type="dxa" w:w="1080"/>
+          </w:tcPr>
+          <w:p>
+            <w:r>
+              <w:rPr>
+                <w:rFonts w:ascii="Times New Roman" w:hAnsi="Times New Roman" w:cs="Times New Roman"/>
+                <w:rFonts w:ascii="Times New Roman" w:hAnsi="Times New Roman"/>
+                <w:b/>
+                <w:sz w:val="18"/>
+              </w:rPr>
+              <w:t>Разработанная система</w:t>
+            </w:r>
+          </w:p>
+        </w:tc>
+      </w:tr>
+      <w:tr>
+        <w:tc>
+          <w:tcPr>
+            <w:tcW w:type="dxa" w:w="1080"/>
+          </w:tcPr>
+          <w:p>
+            <w:r>
+              <w:rPr>
+                <w:rFonts w:ascii="Times New Roman" w:hAnsi="Times New Roman" w:cs="Times New Roman"/>
+                <w:rFonts w:ascii="Times New Roman" w:hAnsi="Times New Roman"/>
+                <w:b w:val="0"/>
+                <w:sz w:val="18"/>
+              </w:rPr>
+              <w:t>Тип доступа</w:t>
+            </w:r>
+          </w:p>
+        </w:tc>
+        <w:tc>
+          <w:tcPr>
+            <w:tcW w:type="dxa" w:w="1080"/>
+          </w:tcPr>
+          <w:p>
+            <w:r>
+              <w:rPr>
+                <w:rFonts w:ascii="Times New Roman" w:hAnsi="Times New Roman" w:cs="Times New Roman"/>
+                <w:rFonts w:ascii="Times New Roman" w:hAnsi="Times New Roman"/>
+                <w:b w:val="0"/>
+                <w:sz w:val="18"/>
+              </w:rPr>
+              <w:t>Десктоп</w:t>
+            </w:r>
+          </w:p>
+        </w:tc>
+        <w:tc>
+          <w:tcPr>
+            <w:tcW w:type="dxa" w:w="1080"/>
+          </w:tcPr>
+          <w:p>
+            <w:r>
+              <w:rPr>
+                <w:rFonts w:ascii="Times New Roman" w:hAnsi="Times New Roman" w:cs="Times New Roman"/>
+                <w:rFonts w:ascii="Times New Roman" w:hAnsi="Times New Roman"/>
+                <w:b w:val="0"/>
+                <w:sz w:val="18"/>
+              </w:rPr>
+              <w:t>Десктоп+Java</w:t>
+            </w:r>
+          </w:p>
+        </w:tc>
+        <w:tc>
+          <w:tcPr>
+            <w:tcW w:type="dxa" w:w="1080"/>
+          </w:tcPr>
+          <w:p>
+            <w:r>
+              <w:rPr>
+                <w:rFonts w:ascii="Times New Roman" w:hAnsi="Times New Roman" w:cs="Times New Roman"/>
+                <w:rFonts w:ascii="Times New Roman" w:hAnsi="Times New Roman"/>
+                <w:b w:val="0"/>
+                <w:sz w:val="18"/>
+              </w:rPr>
+              <w:t>Веб</w:t>
+            </w:r>
+          </w:p>
+        </w:tc>
+        <w:tc>
+          <w:tcPr>
+            <w:tcW w:type="dxa" w:w="1080"/>
+          </w:tcPr>
+          <w:p>
+            <w:r>
+              <w:rPr>
+                <w:rFonts w:ascii="Times New Roman" w:hAnsi="Times New Roman" w:cs="Times New Roman"/>
+                <w:rFonts w:ascii="Times New Roman" w:hAnsi="Times New Roman"/>
+                <w:b w:val="0"/>
+                <w:sz w:val="18"/>
+              </w:rPr>
+              <w:t>R-пакет</w:t>
+            </w:r>
+          </w:p>
+        </w:tc>
+        <w:tc>
+          <w:tcPr>
+            <w:tcW w:type="dxa" w:w="1080"/>
+          </w:tcPr>
+          <w:p>
+            <w:r>
+              <w:rPr>
+                <w:rFonts w:ascii="Times New Roman" w:hAnsi="Times New Roman" w:cs="Times New Roman"/>
+                <w:rFonts w:ascii="Times New Roman" w:hAnsi="Times New Roman"/>
+                <w:b w:val="0"/>
+                <w:sz w:val="18"/>
+              </w:rPr>
+              <w:t>Десктоп</w:t>
+            </w:r>
+          </w:p>
+        </w:tc>
+        <w:tc>
+          <w:tcPr>
+            <w:tcW w:type="dxa" w:w="1080"/>
+          </w:tcPr>
+          <w:p>
+            <w:r>
+              <w:rPr>
+                <w:rFonts w:ascii="Times New Roman" w:hAnsi="Times New Roman" w:cs="Times New Roman"/>
+                <w:rFonts w:ascii="Times New Roman" w:hAnsi="Times New Roman"/>
+                <w:b w:val="0"/>
+                <w:sz w:val="18"/>
+              </w:rPr>
+              <w:t>Веб</w:t>
+            </w:r>
+          </w:p>
+        </w:tc>
+        <w:tc>
+          <w:tcPr>
+            <w:tcW w:type="dxa" w:w="1080"/>
+          </w:tcPr>
+          <w:p>
+            <w:r>
+              <w:rPr>
+                <w:rFonts w:ascii="Times New Roman" w:hAnsi="Times New Roman" w:cs="Times New Roman"/>
+                <w:rFonts w:ascii="Times New Roman" w:hAnsi="Times New Roman"/>
+                <w:b w:val="0"/>
+                <w:sz w:val="18"/>
+              </w:rPr>
+              <w:t>Веб (локальный сервер)</w:t>
+            </w:r>
+          </w:p>
+        </w:tc>
+      </w:tr>
+      <w:tr>
+        <w:tc>
+          <w:tcPr>
+            <w:tcW w:type="dxa" w:w="1080"/>
+          </w:tcPr>
+          <w:p>
+            <w:r>
+              <w:rPr>
+                <w:rFonts w:ascii="Times New Roman" w:hAnsi="Times New Roman" w:cs="Times New Roman"/>
+                <w:rFonts w:ascii="Times New Roman" w:hAnsi="Times New Roman"/>
+                <w:b w:val="0"/>
+                <w:sz w:val="18"/>
+              </w:rPr>
+              <w:t>Установка не нужна</w:t>
+            </w:r>
+          </w:p>
+        </w:tc>
+        <w:tc>
+          <w:tcPr>
+            <w:tcW w:type="dxa" w:w="1080"/>
+          </w:tcPr>
+          <w:p>
+            <w:r>
+              <w:rPr>
+                <w:rFonts w:ascii="Times New Roman" w:hAnsi="Times New Roman" w:cs="Times New Roman"/>
+                <w:rFonts w:ascii="Times New Roman" w:hAnsi="Times New Roman"/>
+                <w:b w:val="0"/>
+                <w:sz w:val="18"/>
+              </w:rPr>
+              <w:t>—</w:t>
+            </w:r>
+          </w:p>
+        </w:tc>
+        <w:tc>
+          <w:tcPr>
+            <w:tcW w:type="dxa" w:w="1080"/>
+          </w:tcPr>
+          <w:p>
+            <w:r>
+              <w:rPr>
+                <w:rFonts w:ascii="Times New Roman" w:hAnsi="Times New Roman" w:cs="Times New Roman"/>
+                <w:rFonts w:ascii="Times New Roman" w:hAnsi="Times New Roman"/>
+                <w:b w:val="0"/>
+                <w:sz w:val="18"/>
+              </w:rPr>
+              <w:t>—</w:t>
+            </w:r>
+          </w:p>
+        </w:tc>
+        <w:tc>
+          <w:tcPr>
+            <w:tcW w:type="dxa" w:w="1080"/>
+          </w:tcPr>
+          <w:p>
+            <w:r>
+              <w:rPr>
+                <w:rFonts w:ascii="Times New Roman" w:hAnsi="Times New Roman" w:cs="Times New Roman"/>
+                <w:rFonts w:ascii="Times New Roman" w:hAnsi="Times New Roman"/>
+                <w:b w:val="0"/>
+                <w:sz w:val="18"/>
+              </w:rPr>
+              <w:t>✓</w:t>
+            </w:r>
+          </w:p>
+        </w:tc>
+        <w:tc>
+          <w:tcPr>
+            <w:tcW w:type="dxa" w:w="1080"/>
+          </w:tcPr>
+          <w:p>
+            <w:r>
+              <w:rPr>
+                <w:rFonts w:ascii="Times New Roman" w:hAnsi="Times New Roman" w:cs="Times New Roman"/>
+                <w:rFonts w:ascii="Times New Roman" w:hAnsi="Times New Roman"/>
+                <w:b w:val="0"/>
+                <w:sz w:val="18"/>
+              </w:rPr>
+              <w:t>—</w:t>
+            </w:r>
+          </w:p>
+        </w:tc>
+        <w:tc>
+          <w:tcPr>
+            <w:tcW w:type="dxa" w:w="1080"/>
+          </w:tcPr>
+          <w:p>
+            <w:r>
+              <w:rPr>
+                <w:rFonts w:ascii="Times New Roman" w:hAnsi="Times New Roman" w:cs="Times New Roman"/>
+                <w:rFonts w:ascii="Times New Roman" w:hAnsi="Times New Roman"/>
+                <w:b w:val="0"/>
+                <w:sz w:val="18"/>
+              </w:rPr>
+              <w:t>—</w:t>
+            </w:r>
+          </w:p>
+        </w:tc>
+        <w:tc>
+          <w:tcPr>
+            <w:tcW w:type="dxa" w:w="1080"/>
+          </w:tcPr>
+          <w:p>
+            <w:r>
+              <w:rPr>
+                <w:rFonts w:ascii="Times New Roman" w:hAnsi="Times New Roman" w:cs="Times New Roman"/>
+                <w:rFonts w:ascii="Times New Roman" w:hAnsi="Times New Roman"/>
+                <w:b w:val="0"/>
+                <w:sz w:val="18"/>
+              </w:rPr>
+              <w:t>✓</w:t>
+            </w:r>
+          </w:p>
+        </w:tc>
+        <w:tc>
+          <w:tcPr>
+            <w:tcW w:type="dxa" w:w="1080"/>
+          </w:tcPr>
+          <w:p>
+            <w:r>
+              <w:rPr>
+                <w:rFonts w:ascii="Times New Roman" w:hAnsi="Times New Roman" w:cs="Times New Roman"/>
+                <w:rFonts w:ascii="Times New Roman" w:hAnsi="Times New Roman"/>
+                <w:b w:val="0"/>
+                <w:sz w:val="18"/>
+              </w:rPr>
+              <w:t>✓</w:t>
+            </w:r>
+          </w:p>
+        </w:tc>
+      </w:tr>
+      <w:tr>
+        <w:tc>
+          <w:tcPr>
+            <w:tcW w:type="dxa" w:w="1080"/>
+          </w:tcPr>
+          <w:p>
+            <w:r>
+              <w:rPr>
+                <w:rFonts w:ascii="Times New Roman" w:hAnsi="Times New Roman" w:cs="Times New Roman"/>
+                <w:rFonts w:ascii="Times New Roman" w:hAnsi="Times New Roman"/>
+                <w:b w:val="0"/>
+                <w:sz w:val="18"/>
+              </w:rPr>
+              <w:t>Источник данных</w:t>
+            </w:r>
+          </w:p>
+        </w:tc>
+        <w:tc>
+          <w:tcPr>
+            <w:tcW w:type="dxa" w:w="1080"/>
+          </w:tcPr>
+          <w:p>
+            <w:r>
+              <w:rPr>
+                <w:rFonts w:ascii="Times New Roman" w:hAnsi="Times New Roman" w:cs="Times New Roman"/>
+                <w:rFonts w:ascii="Times New Roman" w:hAnsi="Times New Roman"/>
+                <w:b w:val="0"/>
+                <w:sz w:val="18"/>
+              </w:rPr>
+              <w:t>WoS, Scopus</w:t>
+            </w:r>
+          </w:p>
+        </w:tc>
+        <w:tc>
+          <w:tcPr>
+            <w:tcW w:type="dxa" w:w="1080"/>
+          </w:tcPr>
+          <w:p>
+            <w:r>
+              <w:rPr>
+                <w:rFonts w:ascii="Times New Roman" w:hAnsi="Times New Roman" w:cs="Times New Roman"/>
+                <w:rFonts w:ascii="Times New Roman" w:hAnsi="Times New Roman"/>
+                <w:b w:val="0"/>
+                <w:sz w:val="18"/>
+              </w:rPr>
+              <w:t>WoS, Scopus</w:t>
+            </w:r>
+          </w:p>
+        </w:tc>
+        <w:tc>
+          <w:tcPr>
+            <w:tcW w:type="dxa" w:w="1080"/>
+          </w:tcPr>
+          <w:p>
+            <w:r>
+              <w:rPr>
+                <w:rFonts w:ascii="Times New Roman" w:hAnsi="Times New Roman" w:cs="Times New Roman"/>
+                <w:rFonts w:ascii="Times New Roman" w:hAnsi="Times New Roman"/>
+                <w:b w:val="0"/>
+                <w:sz w:val="18"/>
+              </w:rPr>
+              <w:t>Semantic Scholar</w:t>
+            </w:r>
+          </w:p>
+        </w:tc>
+        <w:tc>
+          <w:tcPr>
+            <w:tcW w:type="dxa" w:w="1080"/>
+          </w:tcPr>
+          <w:p>
+            <w:r>
+              <w:rPr>
+                <w:rFonts w:ascii="Times New Roman" w:hAnsi="Times New Roman" w:cs="Times New Roman"/>
+                <w:rFonts w:ascii="Times New Roman" w:hAnsi="Times New Roman"/>
+                <w:b w:val="0"/>
+                <w:sz w:val="18"/>
+              </w:rPr>
+              <w:t>WoS, Scopus, OpenAlex</w:t>
+            </w:r>
+          </w:p>
+        </w:tc>
+        <w:tc>
+          <w:tcPr>
+            <w:tcW w:type="dxa" w:w="1080"/>
+          </w:tcPr>
+          <w:p>
+            <w:r>
+              <w:rPr>
+                <w:rFonts w:ascii="Times New Roman" w:hAnsi="Times New Roman" w:cs="Times New Roman"/>
+                <w:rFonts w:ascii="Times New Roman" w:hAnsi="Times New Roman"/>
+                <w:b w:val="0"/>
+                <w:sz w:val="18"/>
+              </w:rPr>
+              <w:t>Импорт файлов</w:t>
+            </w:r>
+          </w:p>
+        </w:tc>
+        <w:tc>
+          <w:tcPr>
+            <w:tcW w:type="dxa" w:w="1080"/>
+          </w:tcPr>
+          <w:p>
+            <w:r>
+              <w:rPr>
+                <w:rFonts w:ascii="Times New Roman" w:hAnsi="Times New Roman" w:cs="Times New Roman"/>
+                <w:rFonts w:ascii="Times New Roman" w:hAnsi="Times New Roman"/>
+                <w:b w:val="0"/>
+                <w:sz w:val="18"/>
+              </w:rPr>
+              <w:t>225 млн+ статей</w:t>
+            </w:r>
+          </w:p>
+        </w:tc>
+        <w:tc>
+          <w:tcPr>
+            <w:tcW w:type="dxa" w:w="1080"/>
+          </w:tcPr>
+          <w:p>
+            <w:r>
+              <w:rPr>
+                <w:rFonts w:ascii="Times New Roman" w:hAnsi="Times New Roman" w:cs="Times New Roman"/>
+                <w:rFonts w:ascii="Times New Roman" w:hAnsi="Times New Roman"/>
+                <w:b w:val="0"/>
+                <w:sz w:val="18"/>
+              </w:rPr>
+              <w:t>OpenAlex (10 000 статей)</w:t>
+            </w:r>
+          </w:p>
+        </w:tc>
+      </w:tr>
+      <w:tr>
+        <w:tc>
+          <w:tcPr>
+            <w:tcW w:type="dxa" w:w="1080"/>
+          </w:tcPr>
+          <w:p>
+            <w:r>
+              <w:rPr>
+                <w:rFonts w:ascii="Times New Roman" w:hAnsi="Times New Roman" w:cs="Times New Roman"/>
+                <w:rFonts w:ascii="Times New Roman" w:hAnsi="Times New Roman"/>
+                <w:b w:val="0"/>
+                <w:sz w:val="18"/>
+              </w:rPr>
+              <w:t>Географическая карта</w:t>
+            </w:r>
+          </w:p>
+        </w:tc>
+        <w:tc>
+          <w:tcPr>
+            <w:tcW w:type="dxa" w:w="1080"/>
+          </w:tcPr>
+          <w:p>
+            <w:r>
+              <w:rPr>
+                <w:rFonts w:ascii="Times New Roman" w:hAnsi="Times New Roman" w:cs="Times New Roman"/>
+                <w:rFonts w:ascii="Times New Roman" w:hAnsi="Times New Roman"/>
+                <w:b w:val="0"/>
+                <w:sz w:val="18"/>
+              </w:rPr>
+              <w:t>✓ (страны)</w:t>
+            </w:r>
+          </w:p>
+        </w:tc>
+        <w:tc>
+          <w:tcPr>
+            <w:tcW w:type="dxa" w:w="1080"/>
+          </w:tcPr>
+          <w:p>
+            <w:r>
+              <w:rPr>
+                <w:rFonts w:ascii="Times New Roman" w:hAnsi="Times New Roman" w:cs="Times New Roman"/>
+                <w:rFonts w:ascii="Times New Roman" w:hAnsi="Times New Roman"/>
+                <w:b w:val="0"/>
+                <w:sz w:val="18"/>
+              </w:rPr>
+              <w:t>✓ (страны)</w:t>
+            </w:r>
+          </w:p>
+        </w:tc>
+        <w:tc>
+          <w:tcPr>
+            <w:tcW w:type="dxa" w:w="1080"/>
+          </w:tcPr>
+          <w:p>
+            <w:r>
+              <w:rPr>
+                <w:rFonts w:ascii="Times New Roman" w:hAnsi="Times New Roman" w:cs="Times New Roman"/>
+                <w:rFonts w:ascii="Times New Roman" w:hAnsi="Times New Roman"/>
+                <w:b w:val="0"/>
+                <w:sz w:val="18"/>
+              </w:rPr>
+              <w:t>—</w:t>
+            </w:r>
+          </w:p>
+        </w:tc>
+        <w:tc>
+          <w:tcPr>
+            <w:tcW w:type="dxa" w:w="1080"/>
+          </w:tcPr>
+          <w:p>
+            <w:r>
+              <w:rPr>
+                <w:rFonts w:ascii="Times New Roman" w:hAnsi="Times New Roman" w:cs="Times New Roman"/>
+                <w:rFonts w:ascii="Times New Roman" w:hAnsi="Times New Roman"/>
+                <w:b w:val="0"/>
+                <w:sz w:val="18"/>
+              </w:rPr>
+              <w:t>✓ (страны)</w:t>
+            </w:r>
+          </w:p>
+        </w:tc>
+        <w:tc>
+          <w:tcPr>
+            <w:tcW w:type="dxa" w:w="1080"/>
+          </w:tcPr>
+          <w:p>
+            <w:r>
+              <w:rPr>
+                <w:rFonts w:ascii="Times New Roman" w:hAnsi="Times New Roman" w:cs="Times New Roman"/>
+                <w:rFonts w:ascii="Times New Roman" w:hAnsi="Times New Roman"/>
+                <w:b w:val="0"/>
+                <w:sz w:val="18"/>
+              </w:rPr>
+              <w:t>—</w:t>
+            </w:r>
+          </w:p>
+        </w:tc>
+        <w:tc>
+          <w:tcPr>
+            <w:tcW w:type="dxa" w:w="1080"/>
+          </w:tcPr>
+          <w:p>
+            <w:r>
+              <w:rPr>
+                <w:rFonts w:ascii="Times New Roman" w:hAnsi="Times New Roman" w:cs="Times New Roman"/>
+                <w:rFonts w:ascii="Times New Roman" w:hAnsi="Times New Roman"/>
+                <w:b w:val="0"/>
+                <w:sz w:val="18"/>
+              </w:rPr>
+              <w:t>✓ (страны)</w:t>
+            </w:r>
+          </w:p>
+        </w:tc>
+        <w:tc>
+          <w:tcPr>
+            <w:tcW w:type="dxa" w:w="1080"/>
+          </w:tcPr>
+          <w:p>
+            <w:r>
+              <w:rPr>
+                <w:rFonts w:ascii="Times New Roman" w:hAnsi="Times New Roman" w:cs="Times New Roman"/>
+                <w:rFonts w:ascii="Times New Roman" w:hAnsi="Times New Roman"/>
+                <w:b w:val="0"/>
+                <w:sz w:val="18"/>
+              </w:rPr>
+              <w:t>✓ (координаты организаций)</w:t>
+            </w:r>
+          </w:p>
+        </w:tc>
+      </w:tr>
+      <w:tr>
+        <w:tc>
+          <w:tcPr>
+            <w:tcW w:type="dxa" w:w="1080"/>
+          </w:tcPr>
+          <w:p>
+            <w:r>
+              <w:rPr>
+                <w:rFonts w:ascii="Times New Roman" w:hAnsi="Times New Roman" w:cs="Times New Roman"/>
+                <w:rFonts w:ascii="Times New Roman" w:hAnsi="Times New Roman"/>
+                <w:b w:val="0"/>
+                <w:sz w:val="18"/>
+              </w:rPr>
+              <w:t>Граф связей</w:t>
+            </w:r>
+          </w:p>
+        </w:tc>
+        <w:tc>
+          <w:tcPr>
+            <w:tcW w:type="dxa" w:w="1080"/>
+          </w:tcPr>
+          <w:p>
+            <w:r>
+              <w:rPr>
+                <w:rFonts w:ascii="Times New Roman" w:hAnsi="Times New Roman" w:cs="Times New Roman"/>
+                <w:rFonts w:ascii="Times New Roman" w:hAnsi="Times New Roman"/>
+                <w:b w:val="0"/>
+                <w:sz w:val="18"/>
+              </w:rPr>
+              <w:t>✓</w:t>
+            </w:r>
+          </w:p>
+        </w:tc>
+        <w:tc>
+          <w:tcPr>
+            <w:tcW w:type="dxa" w:w="1080"/>
+          </w:tcPr>
+          <w:p>
+            <w:r>
+              <w:rPr>
+                <w:rFonts w:ascii="Times New Roman" w:hAnsi="Times New Roman" w:cs="Times New Roman"/>
+                <w:rFonts w:ascii="Times New Roman" w:hAnsi="Times New Roman"/>
+                <w:b w:val="0"/>
+                <w:sz w:val="18"/>
+              </w:rPr>
+              <w:t>✓</w:t>
+            </w:r>
+          </w:p>
+        </w:tc>
+        <w:tc>
+          <w:tcPr>
+            <w:tcW w:type="dxa" w:w="1080"/>
+          </w:tcPr>
+          <w:p>
+            <w:r>
+              <w:rPr>
+                <w:rFonts w:ascii="Times New Roman" w:hAnsi="Times New Roman" w:cs="Times New Roman"/>
+                <w:rFonts w:ascii="Times New Roman" w:hAnsi="Times New Roman"/>
+                <w:b w:val="0"/>
+                <w:sz w:val="18"/>
+              </w:rPr>
+              <w:t>✓</w:t>
+            </w:r>
+          </w:p>
+        </w:tc>
+        <w:tc>
+          <w:tcPr>
+            <w:tcW w:type="dxa" w:w="1080"/>
+          </w:tcPr>
+          <w:p>
+            <w:r>
+              <w:rPr>
+                <w:rFonts w:ascii="Times New Roman" w:hAnsi="Times New Roman" w:cs="Times New Roman"/>
+                <w:rFonts w:ascii="Times New Roman" w:hAnsi="Times New Roman"/>
+                <w:b w:val="0"/>
+                <w:sz w:val="18"/>
+              </w:rPr>
+              <w:t>✓</w:t>
+            </w:r>
+          </w:p>
+        </w:tc>
+        <w:tc>
+          <w:tcPr>
+            <w:tcW w:type="dxa" w:w="1080"/>
+          </w:tcPr>
+          <w:p>
+            <w:r>
+              <w:rPr>
+                <w:rFonts w:ascii="Times New Roman" w:hAnsi="Times New Roman" w:cs="Times New Roman"/>
+                <w:rFonts w:ascii="Times New Roman" w:hAnsi="Times New Roman"/>
+                <w:b w:val="0"/>
+                <w:sz w:val="18"/>
+              </w:rPr>
+              <w:t>✓</w:t>
+            </w:r>
+          </w:p>
+        </w:tc>
+        <w:tc>
+          <w:tcPr>
+            <w:tcW w:type="dxa" w:w="1080"/>
+          </w:tcPr>
+          <w:p>
+            <w:r>
+              <w:rPr>
+                <w:rFonts w:ascii="Times New Roman" w:hAnsi="Times New Roman" w:cs="Times New Roman"/>
+                <w:rFonts w:ascii="Times New Roman" w:hAnsi="Times New Roman"/>
+                <w:b w:val="0"/>
+                <w:sz w:val="18"/>
+              </w:rPr>
+              <w:t>—</w:t>
+            </w:r>
+          </w:p>
+        </w:tc>
+        <w:tc>
+          <w:tcPr>
+            <w:tcW w:type="dxa" w:w="1080"/>
+          </w:tcPr>
+          <w:p>
+            <w:r>
+              <w:rPr>
+                <w:rFonts w:ascii="Times New Roman" w:hAnsi="Times New Roman" w:cs="Times New Roman"/>
+                <w:rFonts w:ascii="Times New Roman" w:hAnsi="Times New Roman"/>
+                <w:b w:val="0"/>
+                <w:sz w:val="18"/>
+              </w:rPr>
+              <w:t>✓ (5 режимов)</w:t>
+            </w:r>
+          </w:p>
+        </w:tc>
+      </w:tr>
+      <w:tr>
+        <w:tc>
+          <w:tcPr>
+            <w:tcW w:type="dxa" w:w="1080"/>
+          </w:tcPr>
+          <w:p>
+            <w:r>
+              <w:rPr>
+                <w:rFonts w:ascii="Times New Roman" w:hAnsi="Times New Roman" w:cs="Times New Roman"/>
+                <w:rFonts w:ascii="Times New Roman" w:hAnsi="Times New Roman"/>
+                <w:b w:val="0"/>
+                <w:sz w:val="18"/>
+              </w:rPr>
+              <w:t>Фасетные фильтры</w:t>
+            </w:r>
+          </w:p>
+        </w:tc>
+        <w:tc>
+          <w:tcPr>
+            <w:tcW w:type="dxa" w:w="1080"/>
+          </w:tcPr>
+          <w:p>
+            <w:r>
+              <w:rPr>
+                <w:rFonts w:ascii="Times New Roman" w:hAnsi="Times New Roman" w:cs="Times New Roman"/>
+                <w:rFonts w:ascii="Times New Roman" w:hAnsi="Times New Roman"/>
+                <w:b w:val="0"/>
+                <w:sz w:val="18"/>
+              </w:rPr>
+              <w:t>Частично</w:t>
+            </w:r>
+          </w:p>
+        </w:tc>
+        <w:tc>
+          <w:tcPr>
+            <w:tcW w:type="dxa" w:w="1080"/>
+          </w:tcPr>
+          <w:p>
+            <w:r>
+              <w:rPr>
+                <w:rFonts w:ascii="Times New Roman" w:hAnsi="Times New Roman" w:cs="Times New Roman"/>
+                <w:rFonts w:ascii="Times New Roman" w:hAnsi="Times New Roman"/>
+                <w:b w:val="0"/>
+                <w:sz w:val="18"/>
+              </w:rPr>
+              <w:t>Частично</w:t>
+            </w:r>
+          </w:p>
+        </w:tc>
+        <w:tc>
+          <w:tcPr>
+            <w:tcW w:type="dxa" w:w="1080"/>
+          </w:tcPr>
+          <w:p>
+            <w:r>
+              <w:rPr>
+                <w:rFonts w:ascii="Times New Roman" w:hAnsi="Times New Roman" w:cs="Times New Roman"/>
+                <w:rFonts w:ascii="Times New Roman" w:hAnsi="Times New Roman"/>
+                <w:b w:val="0"/>
+                <w:sz w:val="18"/>
+              </w:rPr>
+              <w:t>Частично</w:t>
+            </w:r>
+          </w:p>
+        </w:tc>
+        <w:tc>
+          <w:tcPr>
+            <w:tcW w:type="dxa" w:w="1080"/>
+          </w:tcPr>
+          <w:p>
+            <w:r>
+              <w:rPr>
+                <w:rFonts w:ascii="Times New Roman" w:hAnsi="Times New Roman" w:cs="Times New Roman"/>
+                <w:rFonts w:ascii="Times New Roman" w:hAnsi="Times New Roman"/>
+                <w:b w:val="0"/>
+                <w:sz w:val="18"/>
+              </w:rPr>
+              <w:t>✓</w:t>
+            </w:r>
+          </w:p>
+        </w:tc>
+        <w:tc>
+          <w:tcPr>
+            <w:tcW w:type="dxa" w:w="1080"/>
+          </w:tcPr>
+          <w:p>
+            <w:r>
+              <w:rPr>
+                <w:rFonts w:ascii="Times New Roman" w:hAnsi="Times New Roman" w:cs="Times New Roman"/>
+                <w:rFonts w:ascii="Times New Roman" w:hAnsi="Times New Roman"/>
+                <w:b w:val="0"/>
+                <w:sz w:val="18"/>
+              </w:rPr>
+              <w:t>✓</w:t>
+            </w:r>
+          </w:p>
+        </w:tc>
+        <w:tc>
+          <w:tcPr>
+            <w:tcW w:type="dxa" w:w="1080"/>
+          </w:tcPr>
+          <w:p>
+            <w:r>
+              <w:rPr>
+                <w:rFonts w:ascii="Times New Roman" w:hAnsi="Times New Roman" w:cs="Times New Roman"/>
+                <w:rFonts w:ascii="Times New Roman" w:hAnsi="Times New Roman"/>
+                <w:b w:val="0"/>
+                <w:sz w:val="18"/>
+              </w:rPr>
+              <w:t>✓</w:t>
+            </w:r>
+          </w:p>
+        </w:tc>
+        <w:tc>
+          <w:tcPr>
+            <w:tcW w:type="dxa" w:w="1080"/>
+          </w:tcPr>
+          <w:p>
+            <w:r>
+              <w:rPr>
+                <w:rFonts w:ascii="Times New Roman" w:hAnsi="Times New Roman" w:cs="Times New Roman"/>
+                <w:rFonts w:ascii="Times New Roman" w:hAnsi="Times New Roman"/>
+                <w:b w:val="0"/>
+                <w:sz w:val="18"/>
+              </w:rPr>
+              <w:t>✓ (год, журнал, автор, аффилиация)</w:t>
+            </w:r>
+          </w:p>
+        </w:tc>
+      </w:tr>
+      <w:tr>
+        <w:tc>
+          <w:tcPr>
+            <w:tcW w:type="dxa" w:w="1080"/>
+          </w:tcPr>
+          <w:p>
+            <w:r>
+              <w:rPr>
+                <w:rFonts w:ascii="Times New Roman" w:hAnsi="Times New Roman" w:cs="Times New Roman"/>
+                <w:rFonts w:ascii="Times New Roman" w:hAnsi="Times New Roman"/>
+                <w:b w:val="0"/>
+                <w:sz w:val="18"/>
+              </w:rPr>
+              <w:t>Поиск похожих статей</w:t>
+            </w:r>
+          </w:p>
+        </w:tc>
+        <w:tc>
+          <w:tcPr>
+            <w:tcW w:type="dxa" w:w="1080"/>
+          </w:tcPr>
+          <w:p>
+            <w:r>
+              <w:rPr>
+                <w:rFonts w:ascii="Times New Roman" w:hAnsi="Times New Roman" w:cs="Times New Roman"/>
+                <w:rFonts w:ascii="Times New Roman" w:hAnsi="Times New Roman"/>
+                <w:b w:val="0"/>
+                <w:sz w:val="18"/>
+              </w:rPr>
+              <w:t>—</w:t>
+            </w:r>
+          </w:p>
+        </w:tc>
+        <w:tc>
+          <w:tcPr>
+            <w:tcW w:type="dxa" w:w="1080"/>
+          </w:tcPr>
+          <w:p>
+            <w:r>
+              <w:rPr>
+                <w:rFonts w:ascii="Times New Roman" w:hAnsi="Times New Roman" w:cs="Times New Roman"/>
+                <w:rFonts w:ascii="Times New Roman" w:hAnsi="Times New Roman"/>
+                <w:b w:val="0"/>
+                <w:sz w:val="18"/>
+              </w:rPr>
+              <w:t>—</w:t>
+            </w:r>
+          </w:p>
+        </w:tc>
+        <w:tc>
+          <w:tcPr>
+            <w:tcW w:type="dxa" w:w="1080"/>
+          </w:tcPr>
+          <w:p>
+            <w:r>
+              <w:rPr>
+                <w:rFonts w:ascii="Times New Roman" w:hAnsi="Times New Roman" w:cs="Times New Roman"/>
+                <w:rFonts w:ascii="Times New Roman" w:hAnsi="Times New Roman"/>
+                <w:b w:val="0"/>
+                <w:sz w:val="18"/>
+              </w:rPr>
+              <w:t>✓</w:t>
+            </w:r>
+          </w:p>
+        </w:tc>
+        <w:tc>
+          <w:tcPr>
+            <w:tcW w:type="dxa" w:w="1080"/>
+          </w:tcPr>
+          <w:p>
+            <w:r>
+              <w:rPr>
+                <w:rFonts w:ascii="Times New Roman" w:hAnsi="Times New Roman" w:cs="Times New Roman"/>
+                <w:rFonts w:ascii="Times New Roman" w:hAnsi="Times New Roman"/>
+                <w:b w:val="0"/>
+                <w:sz w:val="18"/>
+              </w:rPr>
+              <w:t>—</w:t>
+            </w:r>
+          </w:p>
+        </w:tc>
+        <w:tc>
+          <w:tcPr>
+            <w:tcW w:type="dxa" w:w="1080"/>
+          </w:tcPr>
+          <w:p>
+            <w:r>
+              <w:rPr>
+                <w:rFonts w:ascii="Times New Roman" w:hAnsi="Times New Roman" w:cs="Times New Roman"/>
+                <w:rFonts w:ascii="Times New Roman" w:hAnsi="Times New Roman"/>
+                <w:b w:val="0"/>
+                <w:sz w:val="18"/>
+              </w:rPr>
+              <w:t>—</w:t>
+            </w:r>
+          </w:p>
+        </w:tc>
+        <w:tc>
+          <w:tcPr>
+            <w:tcW w:type="dxa" w:w="1080"/>
+          </w:tcPr>
+          <w:p>
+            <w:r>
+              <w:rPr>
+                <w:rFonts w:ascii="Times New Roman" w:hAnsi="Times New Roman" w:cs="Times New Roman"/>
+                <w:rFonts w:ascii="Times New Roman" w:hAnsi="Times New Roman"/>
+                <w:b w:val="0"/>
+                <w:sz w:val="18"/>
+              </w:rPr>
+              <w:t>—</w:t>
+            </w:r>
+          </w:p>
+        </w:tc>
+        <w:tc>
+          <w:tcPr>
+            <w:tcW w:type="dxa" w:w="1080"/>
+          </w:tcPr>
+          <w:p>
+            <w:r>
+              <w:rPr>
+                <w:rFonts w:ascii="Times New Roman" w:hAnsi="Times New Roman" w:cs="Times New Roman"/>
+                <w:rFonts w:ascii="Times New Roman" w:hAnsi="Times New Roman"/>
+                <w:b w:val="0"/>
+                <w:sz w:val="18"/>
+              </w:rPr>
+              <w:t>✓ (5 признаков с весами)</w:t>
+            </w:r>
+          </w:p>
+        </w:tc>
+      </w:tr>
+      <w:tr>
+        <w:tc>
+          <w:tcPr>
+            <w:tcW w:type="dxa" w:w="1080"/>
+          </w:tcPr>
+          <w:p>
+            <w:r>
+              <w:rPr>
+                <w:rFonts w:ascii="Times New Roman" w:hAnsi="Times New Roman" w:cs="Times New Roman"/>
+                <w:rFonts w:ascii="Times New Roman" w:hAnsi="Times New Roman"/>
+                <w:b w:val="0"/>
+                <w:sz w:val="18"/>
+              </w:rPr>
+              <w:t>Бесплатно</w:t>
+            </w:r>
+          </w:p>
+        </w:tc>
+        <w:tc>
+          <w:tcPr>
+            <w:tcW w:type="dxa" w:w="1080"/>
+          </w:tcPr>
+          <w:p>
+            <w:r>
+              <w:rPr>
+                <w:rFonts w:ascii="Times New Roman" w:hAnsi="Times New Roman" w:cs="Times New Roman"/>
+                <w:rFonts w:ascii="Times New Roman" w:hAnsi="Times New Roman"/>
+                <w:b w:val="0"/>
+                <w:sz w:val="18"/>
+              </w:rPr>
+              <w:t>✓</w:t>
+            </w:r>
+          </w:p>
+        </w:tc>
+        <w:tc>
+          <w:tcPr>
+            <w:tcW w:type="dxa" w:w="1080"/>
+          </w:tcPr>
+          <w:p>
+            <w:r>
+              <w:rPr>
+                <w:rFonts w:ascii="Times New Roman" w:hAnsi="Times New Roman" w:cs="Times New Roman"/>
+                <w:rFonts w:ascii="Times New Roman" w:hAnsi="Times New Roman"/>
+                <w:b w:val="0"/>
+                <w:sz w:val="18"/>
+              </w:rPr>
+              <w:t>✓</w:t>
+            </w:r>
+          </w:p>
+        </w:tc>
+        <w:tc>
+          <w:tcPr>
+            <w:tcW w:type="dxa" w:w="1080"/>
+          </w:tcPr>
+          <w:p>
+            <w:r>
+              <w:rPr>
+                <w:rFonts w:ascii="Times New Roman" w:hAnsi="Times New Roman" w:cs="Times New Roman"/>
+                <w:rFonts w:ascii="Times New Roman" w:hAnsi="Times New Roman"/>
+                <w:b w:val="0"/>
+                <w:sz w:val="18"/>
+              </w:rPr>
+              <w:t>Частично</w:t>
+            </w:r>
+          </w:p>
+        </w:tc>
+        <w:tc>
+          <w:tcPr>
+            <w:tcW w:type="dxa" w:w="1080"/>
+          </w:tcPr>
+          <w:p>
+            <w:r>
+              <w:rPr>
+                <w:rFonts w:ascii="Times New Roman" w:hAnsi="Times New Roman" w:cs="Times New Roman"/>
+                <w:rFonts w:ascii="Times New Roman" w:hAnsi="Times New Roman"/>
+                <w:b w:val="0"/>
+                <w:sz w:val="18"/>
+              </w:rPr>
+              <w:t>✓</w:t>
+            </w:r>
+          </w:p>
+        </w:tc>
+        <w:tc>
+          <w:tcPr>
+            <w:tcW w:type="dxa" w:w="1080"/>
+          </w:tcPr>
+          <w:p>
+            <w:r>
+              <w:rPr>
+                <w:rFonts w:ascii="Times New Roman" w:hAnsi="Times New Roman" w:cs="Times New Roman"/>
+                <w:rFonts w:ascii="Times New Roman" w:hAnsi="Times New Roman"/>
+                <w:b w:val="0"/>
+                <w:sz w:val="18"/>
+              </w:rPr>
+              <w:t>✓</w:t>
+            </w:r>
+          </w:p>
+        </w:tc>
+        <w:tc>
+          <w:tcPr>
+            <w:tcW w:type="dxa" w:w="1080"/>
+          </w:tcPr>
+          <w:p>
+            <w:r>
+              <w:rPr>
+                <w:rFonts w:ascii="Times New Roman" w:hAnsi="Times New Roman" w:cs="Times New Roman"/>
+                <w:rFonts w:ascii="Times New Roman" w:hAnsi="Times New Roman"/>
+                <w:b w:val="0"/>
+                <w:sz w:val="18"/>
+              </w:rPr>
+              <w:t>✓</w:t>
+            </w:r>
+          </w:p>
+        </w:tc>
+        <w:tc>
+          <w:tcPr>
+            <w:tcW w:type="dxa" w:w="1080"/>
+          </w:tcPr>
+          <w:p>
+            <w:r>
+              <w:rPr>
+                <w:rFonts w:ascii="Times New Roman" w:hAnsi="Times New Roman" w:cs="Times New Roman"/>
+                <w:rFonts w:ascii="Times New Roman" w:hAnsi="Times New Roman"/>
+                <w:b w:val="0"/>
+                <w:sz w:val="18"/>
+              </w:rPr>
+              <w:t>✓</w:t>
+            </w:r>
+          </w:p>
+        </w:tc>
+      </w:tr>
+    </w:tbl>
+    <w:p>
+      <w:pPr>
+        <w:spacing w:before="280" w:after="160"/>
+        <w:ind w:firstLine="0"/>
+      </w:pPr>
+      <w:r>
+        <w:rPr>
+          <w:rFonts w:ascii="Times New Roman" w:hAnsi="Times New Roman" w:cs="Times New Roman"/>
+          <w:rFonts w:ascii="Times New Roman" w:hAnsi="Times New Roman"/>
+          <w:b/>
+          <w:sz w:val="28"/>
+        </w:rPr>
+        <w:t>1.8. Выводы из обзора</w:t>
+      </w:r>
+    </w:p>
+    <w:p>
+      <w:pPr>
+        <w:spacing w:before="0" w:after="120"/>
+        <w:ind w:firstLine="709"/>
+        <w:jc w:val="both"/>
+      </w:pPr>
+      <w:r>
+        <w:rPr>
+          <w:rFonts w:ascii="Times New Roman" w:hAnsi="Times New Roman" w:cs="Times New Roman"/>
+          <w:rFonts w:ascii="Times New Roman" w:hAnsi="Times New Roman"/>
+          <w:b w:val="0"/>
+          <w:sz w:val="28"/>
+        </w:rPr>
+        <w:t>Анализ показывает, что каждый из рассмотренных инструментов решает отдельные задачи визуализации, однако ни один не сочетает одновременно все необходимые возможности.</w:t>
+      </w:r>
+    </w:p>
+    <w:p>
+      <w:pPr>
+        <w:spacing w:before="0" w:after="120"/>
+        <w:ind w:firstLine="709"/>
+        <w:jc w:val="both"/>
+      </w:pPr>
+      <w:r>
+        <w:rPr>
+          <w:rFonts w:ascii="Times New Roman" w:hAnsi="Times New Roman" w:cs="Times New Roman"/>
+          <w:rFonts w:ascii="Times New Roman" w:hAnsi="Times New Roman"/>
+          <w:b w:val="0"/>
+          <w:sz w:val="28"/>
+        </w:rPr>
+        <w:t>VOSviewer и CiteSpace — мощные инструменты для сетевого анализа, но требуют установки и предварительной подготовки данных, не имеют алгоритма похожих статей. Connected Papers обладает алгоритмом схожести, но работает только с одной статьёй за раз, не имеет карты и фильтрации по авторам и аффилиациям. Bibliometrix интегрируется с OpenAlex, однако требует знания R и запуска локального сервера. Gephi обрабатывает огромные графы, но не имеет встроенного подключения к научным данным и географической карты. Lens.org предоставляет географическую карту и фильтрацию, но ограничен агрегированными диаграммами без возможности исследовать связи между отдельными статьями.</w:t>
+      </w:r>
+    </w:p>
+    <w:p>
+      <w:pPr>
+        <w:spacing w:before="0" w:after="120"/>
+        <w:ind w:firstLine="709"/>
+        <w:jc w:val="both"/>
+      </w:pPr>
+      <w:r>
+        <w:rPr>
+          <w:rFonts w:ascii="Times New Roman" w:hAnsi="Times New Roman" w:cs="Times New Roman"/>
+          <w:rFonts w:ascii="Times New Roman" w:hAnsi="Times New Roman"/>
+          <w:b w:val="0"/>
+          <w:sz w:val="28"/>
+        </w:rPr>
+        <w:t>Разработанная система занимает нишу, не закрытую существующими решениями: она объединяет в одном браузерном интерфейсе географическую карту с точными координатами организаций, граф связей с пятью режимами, фасетную фильтрацию и алгоритм поиска похожих статей по пяти признакам. При этом не требует установки стороннего программного обеспечения и работает с данными, загруженными напрямую из OpenAlex.</w:t>
+      </w:r>
+    </w:p>
+    <w:p>
+      <w:pPr>
+        <w:spacing w:before="0" w:after="120"/>
+        <w:jc w:val="both"/>
+      </w:pPr>
+      <w:r>
+        <w:rPr>
+          <w:rFonts w:ascii="Times New Roman" w:hAnsi="Times New Roman" w:cs="Times New Roman"/>
+          <w:rFonts w:ascii="Times New Roman" w:hAnsi="Times New Roman"/>
+          <w:b w:val="0"/>
+          <w:sz w:val="28"/>
+        </w:rPr>
+      </w:r>
+    </w:p>
+    <w:p>
+      <w:pPr>
         <w:pStyle w:val="Heading1"/>
         <w:spacing w:before="240" w:after="120"/>
       </w:pPr>
@@ -454,7 +2239,7 @@
           <w:color w:val="000000"/>
           <w:sz w:val="32"/>
         </w:rPr>
-        <w:t>ГЛАВА I. ЗАГРУЗКА ДАННЫХ ИЗ OPENALEX</w:t>
+        <w:t>ГЛАВА II. ЗАГРУЗКА ДАННЫХ ИЗ OPENALEX</w:t>
       </w:r>
     </w:p>
     <w:p>
@@ -682,7 +2467,7 @@
           <w:color w:val="000000"/>
           <w:sz w:val="32"/>
         </w:rPr>
-        <w:t>ГЛАВА II. БАЗА ДАННЫХ</w:t>
+        <w:t>ГЛАВА III. БАЗА ДАННЫХ</w:t>
       </w:r>
     </w:p>
     <w:p>
@@ -1492,7 +3277,7 @@
           <w:color w:val="000000"/>
           <w:sz w:val="32"/>
         </w:rPr>
-        <w:t>ГЛАВА III. ГЕОГРАФИЧЕСКАЯ ПРИВЯЗКА</w:t>
+        <w:t>ГЛАВА IV. ГЕОГРАФИЧЕСКАЯ ПРИВЯЗКА</w:t>
       </w:r>
     </w:p>
     <w:p>
@@ -2110,7 +3895,7 @@
           <w:color w:val="000000"/>
           <w:sz w:val="32"/>
         </w:rPr>
-        <w:t>ГЛАВА IV. ИНТЕРФЕЙС И ВИЗУАЛИЗАЦИЯ ДАННЫХ</w:t>
+        <w:t>ГЛАВА V. ИНТЕРФЕЙС И ВИЗУАЛИЗАЦИЯ ДАННЫХ</w:t>
       </w:r>
     </w:p>
     <w:p>
@@ -2265,7 +4050,7 @@
           <w:color w:val="000000"/>
           <w:sz w:val="32"/>
         </w:rPr>
-        <w:t>ГЛАВА V. ГРАФ СВЯЗЕЙ</w:t>
+        <w:t>ГЛАВА VI. ГРАФ СВЯЗЕЙ</w:t>
       </w:r>
     </w:p>
     <w:p>
@@ -2685,7 +4470,7 @@
           <w:color w:val="000000"/>
           <w:sz w:val="32"/>
         </w:rPr>
-        <w:t>ГЛАВА VI. ПОИСК ПОХОЖИХ СТАТЕЙ</w:t>
+        <w:t>ГЛАВА VII. ПОИСК ПОХОЖИХ СТАТЕЙ</w:t>
       </w:r>
     </w:p>
     <w:p>
@@ -3142,7 +4927,7 @@
           <w:color w:val="000000"/>
           <w:sz w:val="32"/>
         </w:rPr>
-        <w:t>ГЛАВА VII. ПРОБЛЕМЫ В ХОДЕ РАЗРАБОТКИ</w:t>
+        <w:t>ГЛАВА VIII. ПРОБЛЕМЫ В ХОДЕ РАЗРАБОТКИ</w:t>
       </w:r>
     </w:p>
     <w:p>

</xml_diff>

<commit_message>
Add auto TOC and heading styles to diploma docx
</commit_message>
<xml_diff>
--- a/docs/диплом.docx
+++ b/docs/диплом.docx
@@ -35,6 +35,7 @@
     <w:p>
       <w:pPr>
         <w:jc w:val="center"/>
+        <w:pStyle w:val="Heading1"/>
         <w:spacing w:before="320" w:after="120" w:lineRule="auto" w:line="360"/>
       </w:pPr>
       <w:r>
@@ -89,8 +90,48 @@
       </w:r>
     </w:p>
     <w:p>
+      <w:r>
+        <w:br w:type="page"/>
+      </w:r>
+    </w:p>
+    <w:p>
       <w:pPr>
         <w:jc w:val="center"/>
+      </w:pPr>
+      <w:r>
+        <w:rPr>
+          <w:b/>
+          <w:sz w:val="28"/>
+        </w:rPr>
+        <w:t>ОГЛАВЛЕНИЕ</w:t>
+      </w:r>
+    </w:p>
+    <w:p>
+      <w:r>
+        <w:fldChar w:fldCharType="begin" w:dirty="true"/>
+      </w:r>
+      <w:r>
+        <w:instrText xml:space="preserve"> TOC \o "1-2" \h \z \u </w:instrText>
+      </w:r>
+      <w:r>
+        <w:fldChar w:fldCharType="separate"/>
+      </w:r>
+      <w:r>
+        <w:t>[Нажмите правой кнопкой → Обновить поле]</w:t>
+      </w:r>
+      <w:r>
+        <w:fldChar w:fldCharType="end"/>
+      </w:r>
+    </w:p>
+    <w:p>
+      <w:r>
+        <w:br w:type="page"/>
+      </w:r>
+    </w:p>
+    <w:p>
+      <w:pPr>
+        <w:jc w:val="center"/>
+        <w:pStyle w:val="Heading1"/>
         <w:spacing w:before="320" w:after="120" w:lineRule="auto" w:line="360"/>
       </w:pPr>
       <w:r>
@@ -1645,6 +1686,7 @@
     <w:p>
       <w:pPr>
         <w:jc w:val="center"/>
+        <w:pStyle w:val="Heading1"/>
         <w:spacing w:before="320" w:after="120" w:lineRule="auto" w:line="360"/>
       </w:pPr>
       <w:r>
@@ -1676,12 +1718,13 @@
     <w:p>
       <w:pPr>
         <w:jc w:val="left"/>
+        <w:pStyle w:val="Heading2"/>
         <w:spacing w:before="240" w:after="80" w:lineRule="auto" w:line="360"/>
       </w:pPr>
       <w:r>
         <w:rPr>
           <w:rFonts w:ascii="Times New Roman" w:hAnsi="Times New Roman" w:cs="Times New Roman" w:eastAsia="Times New Roman"/>
-          <w:b/>
+          <w:b w:val="0"/>
           <w:i w:val="0"/>
           <w:sz w:val="28"/>
         </w:rPr>
@@ -1782,12 +1825,13 @@
     <w:p>
       <w:pPr>
         <w:jc w:val="left"/>
+        <w:pStyle w:val="Heading2"/>
         <w:spacing w:before="240" w:after="80" w:lineRule="auto" w:line="360"/>
       </w:pPr>
       <w:r>
         <w:rPr>
           <w:rFonts w:ascii="Times New Roman" w:hAnsi="Times New Roman" w:cs="Times New Roman" w:eastAsia="Times New Roman"/>
-          <w:b/>
+          <w:b w:val="0"/>
           <w:i w:val="0"/>
           <w:sz w:val="28"/>
         </w:rPr>
@@ -1888,12 +1932,13 @@
     <w:p>
       <w:pPr>
         <w:jc w:val="left"/>
+        <w:pStyle w:val="Heading2"/>
         <w:spacing w:before="240" w:after="80" w:lineRule="auto" w:line="360"/>
       </w:pPr>
       <w:r>
         <w:rPr>
           <w:rFonts w:ascii="Times New Roman" w:hAnsi="Times New Roman" w:cs="Times New Roman" w:eastAsia="Times New Roman"/>
-          <w:b/>
+          <w:b w:val="0"/>
           <w:i w:val="0"/>
           <w:sz w:val="28"/>
         </w:rPr>
@@ -1994,12 +2039,13 @@
     <w:p>
       <w:pPr>
         <w:jc w:val="left"/>
+        <w:pStyle w:val="Heading2"/>
         <w:spacing w:before="240" w:after="80" w:lineRule="auto" w:line="360"/>
       </w:pPr>
       <w:r>
         <w:rPr>
           <w:rFonts w:ascii="Times New Roman" w:hAnsi="Times New Roman" w:cs="Times New Roman" w:eastAsia="Times New Roman"/>
-          <w:b/>
+          <w:b w:val="0"/>
           <w:i w:val="0"/>
           <w:sz w:val="28"/>
         </w:rPr>
@@ -2100,12 +2146,13 @@
     <w:p>
       <w:pPr>
         <w:jc w:val="left"/>
+        <w:pStyle w:val="Heading2"/>
         <w:spacing w:before="240" w:after="80" w:lineRule="auto" w:line="360"/>
       </w:pPr>
       <w:r>
         <w:rPr>
           <w:rFonts w:ascii="Times New Roman" w:hAnsi="Times New Roman" w:cs="Times New Roman" w:eastAsia="Times New Roman"/>
-          <w:b/>
+          <w:b w:val="0"/>
           <w:i w:val="0"/>
           <w:sz w:val="28"/>
         </w:rPr>
@@ -2181,12 +2228,13 @@
     <w:p>
       <w:pPr>
         <w:jc w:val="left"/>
+        <w:pStyle w:val="Heading2"/>
         <w:spacing w:before="240" w:after="80" w:lineRule="auto" w:line="360"/>
       </w:pPr>
       <w:r>
         <w:rPr>
           <w:rFonts w:ascii="Times New Roman" w:hAnsi="Times New Roman" w:cs="Times New Roman" w:eastAsia="Times New Roman"/>
-          <w:b/>
+          <w:b w:val="0"/>
           <w:i w:val="0"/>
           <w:sz w:val="28"/>
         </w:rPr>
@@ -2287,12 +2335,13 @@
     <w:p>
       <w:pPr>
         <w:jc w:val="left"/>
+        <w:pStyle w:val="Heading2"/>
         <w:spacing w:before="240" w:after="80" w:lineRule="auto" w:line="360"/>
       </w:pPr>
       <w:r>
         <w:rPr>
           <w:rFonts w:ascii="Times New Roman" w:hAnsi="Times New Roman" w:cs="Times New Roman" w:eastAsia="Times New Roman"/>
-          <w:b/>
+          <w:b w:val="0"/>
           <w:i w:val="0"/>
           <w:sz w:val="28"/>
         </w:rPr>
@@ -4276,12 +4325,13 @@
     <w:p>
       <w:pPr>
         <w:jc w:val="left"/>
+        <w:pStyle w:val="Heading2"/>
         <w:spacing w:before="240" w:after="80" w:lineRule="auto" w:line="360"/>
       </w:pPr>
       <w:r>
         <w:rPr>
           <w:rFonts w:ascii="Times New Roman" w:hAnsi="Times New Roman" w:cs="Times New Roman" w:eastAsia="Times New Roman"/>
-          <w:b/>
+          <w:b w:val="0"/>
           <w:i w:val="0"/>
           <w:sz w:val="28"/>
         </w:rPr>
@@ -4520,6 +4570,7 @@
     <w:p>
       <w:pPr>
         <w:jc w:val="center"/>
+        <w:pStyle w:val="Heading1"/>
         <w:spacing w:before="320" w:after="120" w:lineRule="auto" w:line="360"/>
       </w:pPr>
       <w:r>
@@ -4535,12 +4586,13 @@
     <w:p>
       <w:pPr>
         <w:jc w:val="left"/>
+        <w:pStyle w:val="Heading2"/>
         <w:spacing w:before="240" w:after="80" w:lineRule="auto" w:line="360"/>
       </w:pPr>
       <w:r>
         <w:rPr>
           <w:rFonts w:ascii="Times New Roman" w:hAnsi="Times New Roman" w:cs="Times New Roman" w:eastAsia="Times New Roman"/>
-          <w:b/>
+          <w:b w:val="0"/>
           <w:i w:val="0"/>
           <w:sz w:val="28"/>
         </w:rPr>
@@ -5359,12 +5411,13 @@
     <w:p>
       <w:pPr>
         <w:jc w:val="left"/>
+        <w:pStyle w:val="Heading2"/>
         <w:spacing w:before="240" w:after="80" w:lineRule="auto" w:line="360"/>
       </w:pPr>
       <w:r>
         <w:rPr>
           <w:rFonts w:ascii="Times New Roman" w:hAnsi="Times New Roman" w:cs="Times New Roman" w:eastAsia="Times New Roman"/>
-          <w:b/>
+          <w:b w:val="0"/>
           <w:i w:val="0"/>
           <w:sz w:val="28"/>
         </w:rPr>
@@ -5742,12 +5795,13 @@
     <w:p>
       <w:pPr>
         <w:jc w:val="left"/>
+        <w:pStyle w:val="Heading2"/>
         <w:spacing w:before="240" w:after="80" w:lineRule="auto" w:line="360"/>
       </w:pPr>
       <w:r>
         <w:rPr>
           <w:rFonts w:ascii="Times New Roman" w:hAnsi="Times New Roman" w:cs="Times New Roman" w:eastAsia="Times New Roman"/>
-          <w:b/>
+          <w:b w:val="0"/>
           <w:i w:val="0"/>
           <w:sz w:val="28"/>
         </w:rPr>
@@ -6055,6 +6109,7 @@
     <w:p>
       <w:pPr>
         <w:jc w:val="center"/>
+        <w:pStyle w:val="Heading1"/>
         <w:spacing w:before="320" w:after="120" w:lineRule="auto" w:line="360"/>
       </w:pPr>
       <w:r>
@@ -6070,12 +6125,13 @@
     <w:p>
       <w:pPr>
         <w:jc w:val="left"/>
+        <w:pStyle w:val="Heading2"/>
         <w:spacing w:before="240" w:after="80" w:lineRule="auto" w:line="360"/>
       </w:pPr>
       <w:r>
         <w:rPr>
           <w:rFonts w:ascii="Times New Roman" w:hAnsi="Times New Roman" w:cs="Times New Roman" w:eastAsia="Times New Roman"/>
-          <w:b/>
+          <w:b w:val="0"/>
           <w:i w:val="0"/>
           <w:sz w:val="28"/>
         </w:rPr>
@@ -6133,12 +6189,13 @@
     <w:p>
       <w:pPr>
         <w:jc w:val="left"/>
+        <w:pStyle w:val="Heading2"/>
         <w:spacing w:before="240" w:after="80" w:lineRule="auto" w:line="360"/>
       </w:pPr>
       <w:r>
         <w:rPr>
           <w:rFonts w:ascii="Times New Roman" w:hAnsi="Times New Roman" w:cs="Times New Roman" w:eastAsia="Times New Roman"/>
-          <w:b/>
+          <w:b w:val="0"/>
           <w:i w:val="0"/>
           <w:sz w:val="28"/>
         </w:rPr>
@@ -6774,12 +6831,13 @@
     <w:p>
       <w:pPr>
         <w:jc w:val="left"/>
+        <w:pStyle w:val="Heading2"/>
         <w:spacing w:before="240" w:after="80" w:lineRule="auto" w:line="360"/>
       </w:pPr>
       <w:r>
         <w:rPr>
           <w:rFonts w:ascii="Times New Roman" w:hAnsi="Times New Roman" w:cs="Times New Roman" w:eastAsia="Times New Roman"/>
-          <w:b/>
+          <w:b w:val="0"/>
           <w:i w:val="0"/>
           <w:sz w:val="28"/>
         </w:rPr>
@@ -7127,6 +7185,7 @@
     <w:p>
       <w:pPr>
         <w:jc w:val="center"/>
+        <w:pStyle w:val="Heading1"/>
         <w:spacing w:before="320" w:after="120" w:lineRule="auto" w:line="360"/>
       </w:pPr>
       <w:r>
@@ -7142,12 +7201,13 @@
     <w:p>
       <w:pPr>
         <w:jc w:val="left"/>
+        <w:pStyle w:val="Heading2"/>
         <w:spacing w:before="240" w:after="80" w:lineRule="auto" w:line="360"/>
       </w:pPr>
       <w:r>
         <w:rPr>
           <w:rFonts w:ascii="Times New Roman" w:hAnsi="Times New Roman" w:cs="Times New Roman" w:eastAsia="Times New Roman"/>
-          <w:b/>
+          <w:b w:val="0"/>
           <w:i w:val="0"/>
           <w:sz w:val="28"/>
         </w:rPr>
@@ -7173,12 +7233,13 @@
     <w:p>
       <w:pPr>
         <w:jc w:val="left"/>
+        <w:pStyle w:val="Heading2"/>
         <w:spacing w:before="240" w:after="80" w:lineRule="auto" w:line="360"/>
       </w:pPr>
       <w:r>
         <w:rPr>
           <w:rFonts w:ascii="Times New Roman" w:hAnsi="Times New Roman" w:cs="Times New Roman" w:eastAsia="Times New Roman"/>
-          <w:b/>
+          <w:b w:val="0"/>
           <w:i w:val="0"/>
           <w:sz w:val="28"/>
         </w:rPr>
@@ -7402,12 +7463,13 @@
     <w:p>
       <w:pPr>
         <w:jc w:val="left"/>
+        <w:pStyle w:val="Heading2"/>
         <w:spacing w:before="240" w:after="80" w:lineRule="auto" w:line="360"/>
       </w:pPr>
       <w:r>
         <w:rPr>
           <w:rFonts w:ascii="Times New Roman" w:hAnsi="Times New Roman" w:cs="Times New Roman" w:eastAsia="Times New Roman"/>
-          <w:b/>
+          <w:b w:val="0"/>
           <w:i w:val="0"/>
           <w:sz w:val="28"/>
         </w:rPr>
@@ -8718,12 +8780,13 @@
     <w:p>
       <w:pPr>
         <w:jc w:val="left"/>
+        <w:pStyle w:val="Heading2"/>
         <w:spacing w:before="240" w:after="80" w:lineRule="auto" w:line="360"/>
       </w:pPr>
       <w:r>
         <w:rPr>
           <w:rFonts w:ascii="Times New Roman" w:hAnsi="Times New Roman" w:cs="Times New Roman" w:eastAsia="Times New Roman"/>
-          <w:b/>
+          <w:b w:val="0"/>
           <w:i w:val="0"/>
           <w:sz w:val="28"/>
         </w:rPr>
@@ -9228,12 +9291,13 @@
     <w:p>
       <w:pPr>
         <w:jc w:val="left"/>
+        <w:pStyle w:val="Heading2"/>
         <w:spacing w:before="240" w:after="80" w:lineRule="auto" w:line="360"/>
       </w:pPr>
       <w:r>
         <w:rPr>
           <w:rFonts w:ascii="Times New Roman" w:hAnsi="Times New Roman" w:cs="Times New Roman" w:eastAsia="Times New Roman"/>
-          <w:b/>
+          <w:b w:val="0"/>
           <w:i w:val="0"/>
           <w:sz w:val="28"/>
         </w:rPr>
@@ -9595,6 +9659,7 @@
     <w:p>
       <w:pPr>
         <w:jc w:val="center"/>
+        <w:pStyle w:val="Heading1"/>
         <w:spacing w:before="320" w:after="120" w:lineRule="auto" w:line="360"/>
       </w:pPr>
       <w:r>
@@ -9610,12 +9675,13 @@
     <w:p>
       <w:pPr>
         <w:jc w:val="left"/>
+        <w:pStyle w:val="Heading2"/>
         <w:spacing w:before="240" w:after="80" w:lineRule="auto" w:line="360"/>
       </w:pPr>
       <w:r>
         <w:rPr>
           <w:rFonts w:ascii="Times New Roman" w:hAnsi="Times New Roman" w:cs="Times New Roman" w:eastAsia="Times New Roman"/>
-          <w:b/>
+          <w:b w:val="0"/>
           <w:i w:val="0"/>
           <w:sz w:val="28"/>
         </w:rPr>
@@ -9923,12 +9989,13 @@
     <w:p>
       <w:pPr>
         <w:jc w:val="left"/>
+        <w:pStyle w:val="Heading2"/>
         <w:spacing w:before="240" w:after="80" w:lineRule="auto" w:line="360"/>
       </w:pPr>
       <w:r>
         <w:rPr>
           <w:rFonts w:ascii="Times New Roman" w:hAnsi="Times New Roman" w:cs="Times New Roman" w:eastAsia="Times New Roman"/>
-          <w:b/>
+          <w:b w:val="0"/>
           <w:i w:val="0"/>
           <w:sz w:val="28"/>
         </w:rPr>
@@ -10466,12 +10533,13 @@
     <w:p>
       <w:pPr>
         <w:jc w:val="left"/>
+        <w:pStyle w:val="Heading2"/>
         <w:spacing w:before="240" w:after="80" w:lineRule="auto" w:line="360"/>
       </w:pPr>
       <w:r>
         <w:rPr>
           <w:rFonts w:ascii="Times New Roman" w:hAnsi="Times New Roman" w:cs="Times New Roman" w:eastAsia="Times New Roman"/>
-          <w:b/>
+          <w:b w:val="0"/>
           <w:i w:val="0"/>
           <w:sz w:val="28"/>
         </w:rPr>
@@ -11151,6 +11219,7 @@
     <w:p>
       <w:pPr>
         <w:jc w:val="center"/>
+        <w:pStyle w:val="Heading1"/>
         <w:spacing w:before="320" w:after="120" w:lineRule="auto" w:line="360"/>
       </w:pPr>
       <w:r>
@@ -11166,12 +11235,13 @@
     <w:p>
       <w:pPr>
         <w:jc w:val="left"/>
+        <w:pStyle w:val="Heading2"/>
         <w:spacing w:before="240" w:after="80" w:lineRule="auto" w:line="360"/>
       </w:pPr>
       <w:r>
         <w:rPr>
           <w:rFonts w:ascii="Times New Roman" w:hAnsi="Times New Roman" w:cs="Times New Roman" w:eastAsia="Times New Roman"/>
-          <w:b/>
+          <w:b w:val="0"/>
           <w:i w:val="0"/>
           <w:sz w:val="28"/>
         </w:rPr>
@@ -11349,12 +11419,13 @@
     <w:p>
       <w:pPr>
         <w:jc w:val="left"/>
+        <w:pStyle w:val="Heading2"/>
         <w:spacing w:before="240" w:after="80" w:lineRule="auto" w:line="360"/>
       </w:pPr>
       <w:r>
         <w:rPr>
           <w:rFonts w:ascii="Times New Roman" w:hAnsi="Times New Roman" w:cs="Times New Roman" w:eastAsia="Times New Roman"/>
-          <w:b/>
+          <w:b w:val="0"/>
           <w:i w:val="0"/>
           <w:sz w:val="28"/>
         </w:rPr>
@@ -11398,12 +11469,13 @@
     <w:p>
       <w:pPr>
         <w:jc w:val="left"/>
+        <w:pStyle w:val="Heading2"/>
         <w:spacing w:before="240" w:after="80" w:lineRule="auto" w:line="360"/>
       </w:pPr>
       <w:r>
         <w:rPr>
           <w:rFonts w:ascii="Times New Roman" w:hAnsi="Times New Roman" w:cs="Times New Roman" w:eastAsia="Times New Roman"/>
-          <w:b/>
+          <w:b w:val="0"/>
           <w:i w:val="0"/>
           <w:sz w:val="28"/>
         </w:rPr>
@@ -11429,12 +11501,13 @@
     <w:p>
       <w:pPr>
         <w:jc w:val="left"/>
+        <w:pStyle w:val="Heading2"/>
         <w:spacing w:before="240" w:after="80" w:lineRule="auto" w:line="360"/>
       </w:pPr>
       <w:r>
         <w:rPr>
           <w:rFonts w:ascii="Times New Roman" w:hAnsi="Times New Roman" w:cs="Times New Roman" w:eastAsia="Times New Roman"/>
-          <w:b/>
+          <w:b w:val="0"/>
           <w:i w:val="0"/>
           <w:sz w:val="28"/>
         </w:rPr>
@@ -11460,12 +11533,13 @@
     <w:p>
       <w:pPr>
         <w:jc w:val="left"/>
+        <w:pStyle w:val="Heading2"/>
         <w:spacing w:before="240" w:after="80" w:lineRule="auto" w:line="360"/>
       </w:pPr>
       <w:r>
         <w:rPr>
           <w:rFonts w:ascii="Times New Roman" w:hAnsi="Times New Roman" w:cs="Times New Roman" w:eastAsia="Times New Roman"/>
-          <w:b/>
+          <w:b w:val="0"/>
           <w:i w:val="0"/>
           <w:sz w:val="28"/>
         </w:rPr>
@@ -11600,6 +11674,7 @@
     <w:p>
       <w:pPr>
         <w:jc w:val="center"/>
+        <w:pStyle w:val="Heading1"/>
         <w:spacing w:before="320" w:after="120" w:lineRule="auto" w:line="360"/>
       </w:pPr>
       <w:r>
@@ -11615,12 +11690,13 @@
     <w:p>
       <w:pPr>
         <w:jc w:val="left"/>
+        <w:pStyle w:val="Heading2"/>
         <w:spacing w:before="240" w:after="80" w:lineRule="auto" w:line="360"/>
       </w:pPr>
       <w:r>
         <w:rPr>
           <w:rFonts w:ascii="Times New Roman" w:hAnsi="Times New Roman" w:cs="Times New Roman" w:eastAsia="Times New Roman"/>
-          <w:b/>
+          <w:b w:val="0"/>
           <w:i w:val="0"/>
           <w:sz w:val="28"/>
         </w:rPr>
@@ -11758,12 +11834,13 @@
     <w:p>
       <w:pPr>
         <w:jc w:val="left"/>
+        <w:pStyle w:val="Heading2"/>
         <w:spacing w:before="240" w:after="80" w:lineRule="auto" w:line="360"/>
       </w:pPr>
       <w:r>
         <w:rPr>
           <w:rFonts w:ascii="Times New Roman" w:hAnsi="Times New Roman" w:cs="Times New Roman" w:eastAsia="Times New Roman"/>
-          <w:b/>
+          <w:b w:val="0"/>
           <w:i w:val="0"/>
           <w:sz w:val="28"/>
         </w:rPr>
@@ -11968,12 +12045,13 @@
     <w:p>
       <w:pPr>
         <w:jc w:val="left"/>
+        <w:pStyle w:val="Heading2"/>
         <w:spacing w:before="240" w:after="80" w:lineRule="auto" w:line="360"/>
       </w:pPr>
       <w:r>
         <w:rPr>
           <w:rFonts w:ascii="Times New Roman" w:hAnsi="Times New Roman" w:cs="Times New Roman" w:eastAsia="Times New Roman"/>
-          <w:b/>
+          <w:b w:val="0"/>
           <w:i w:val="0"/>
           <w:sz w:val="28"/>
         </w:rPr>
@@ -12794,6 +12872,7 @@
     <w:p>
       <w:pPr>
         <w:jc w:val="center"/>
+        <w:pStyle w:val="Heading1"/>
         <w:spacing w:before="320" w:after="120" w:lineRule="auto" w:line="360"/>
       </w:pPr>
       <w:r>
@@ -12809,12 +12888,13 @@
     <w:p>
       <w:pPr>
         <w:jc w:val="left"/>
+        <w:pStyle w:val="Heading2"/>
         <w:spacing w:before="240" w:after="80" w:lineRule="auto" w:line="360"/>
       </w:pPr>
       <w:r>
         <w:rPr>
           <w:rFonts w:ascii="Times New Roman" w:hAnsi="Times New Roman" w:cs="Times New Roman" w:eastAsia="Times New Roman"/>
-          <w:b/>
+          <w:b w:val="0"/>
           <w:i w:val="0"/>
           <w:sz w:val="28"/>
         </w:rPr>
@@ -13132,12 +13212,13 @@
     <w:p>
       <w:pPr>
         <w:jc w:val="left"/>
+        <w:pStyle w:val="Heading2"/>
         <w:spacing w:before="240" w:after="80" w:lineRule="auto" w:line="360"/>
       </w:pPr>
       <w:r>
         <w:rPr>
           <w:rFonts w:ascii="Times New Roman" w:hAnsi="Times New Roman" w:cs="Times New Roman" w:eastAsia="Times New Roman"/>
-          <w:b/>
+          <w:b w:val="0"/>
           <w:i w:val="0"/>
           <w:sz w:val="28"/>
         </w:rPr>
@@ -13626,12 +13707,13 @@
     <w:p>
       <w:pPr>
         <w:jc w:val="left"/>
+        <w:pStyle w:val="Heading2"/>
         <w:spacing w:before="240" w:after="80" w:lineRule="auto" w:line="360"/>
       </w:pPr>
       <w:r>
         <w:rPr>
           <w:rFonts w:ascii="Times New Roman" w:hAnsi="Times New Roman" w:cs="Times New Roman" w:eastAsia="Times New Roman"/>
-          <w:b/>
+          <w:b w:val="0"/>
           <w:i w:val="0"/>
           <w:sz w:val="28"/>
         </w:rPr>
@@ -13657,12 +13739,13 @@
     <w:p>
       <w:pPr>
         <w:jc w:val="left"/>
+        <w:pStyle w:val="Heading2"/>
         <w:spacing w:before="240" w:after="80" w:lineRule="auto" w:line="360"/>
       </w:pPr>
       <w:r>
         <w:rPr>
           <w:rFonts w:ascii="Times New Roman" w:hAnsi="Times New Roman" w:cs="Times New Roman" w:eastAsia="Times New Roman"/>
-          <w:b/>
+          <w:b w:val="0"/>
           <w:i w:val="0"/>
           <w:sz w:val="28"/>
         </w:rPr>
@@ -13722,6 +13805,7 @@
     <w:p>
       <w:pPr>
         <w:jc w:val="center"/>
+        <w:pStyle w:val="Heading1"/>
         <w:spacing w:before="320" w:after="120" w:lineRule="auto" w:line="360"/>
       </w:pPr>
       <w:r>
@@ -13737,12 +13821,13 @@
     <w:p>
       <w:pPr>
         <w:jc w:val="left"/>
+        <w:pStyle w:val="Heading2"/>
         <w:spacing w:before="240" w:after="80" w:lineRule="auto" w:line="360"/>
       </w:pPr>
       <w:r>
         <w:rPr>
           <w:rFonts w:ascii="Times New Roman" w:hAnsi="Times New Roman" w:cs="Times New Roman" w:eastAsia="Times New Roman"/>
-          <w:b/>
+          <w:b w:val="0"/>
           <w:i w:val="0"/>
           <w:sz w:val="28"/>
         </w:rPr>
@@ -13874,12 +13959,13 @@
     <w:p>
       <w:pPr>
         <w:jc w:val="left"/>
+        <w:pStyle w:val="Heading2"/>
         <w:spacing w:before="240" w:after="80" w:lineRule="auto" w:line="360"/>
       </w:pPr>
       <w:r>
         <w:rPr>
           <w:rFonts w:ascii="Times New Roman" w:hAnsi="Times New Roman" w:cs="Times New Roman" w:eastAsia="Times New Roman"/>
-          <w:b/>
+          <w:b w:val="0"/>
           <w:i w:val="0"/>
           <w:sz w:val="28"/>
         </w:rPr>
@@ -13957,12 +14043,13 @@
     <w:p>
       <w:pPr>
         <w:jc w:val="left"/>
+        <w:pStyle w:val="Heading2"/>
         <w:spacing w:before="240" w:after="80" w:lineRule="auto" w:line="360"/>
       </w:pPr>
       <w:r>
         <w:rPr>
           <w:rFonts w:ascii="Times New Roman" w:hAnsi="Times New Roman" w:cs="Times New Roman" w:eastAsia="Times New Roman"/>
-          <w:b/>
+          <w:b w:val="0"/>
           <w:i w:val="0"/>
           <w:sz w:val="28"/>
         </w:rPr>
@@ -14058,12 +14145,13 @@
     <w:p>
       <w:pPr>
         <w:jc w:val="left"/>
+        <w:pStyle w:val="Heading2"/>
         <w:spacing w:before="240" w:after="80" w:lineRule="auto" w:line="360"/>
       </w:pPr>
       <w:r>
         <w:rPr>
           <w:rFonts w:ascii="Times New Roman" w:hAnsi="Times New Roman" w:cs="Times New Roman" w:eastAsia="Times New Roman"/>
-          <w:b/>
+          <w:b w:val="0"/>
           <w:i w:val="0"/>
           <w:sz w:val="28"/>
         </w:rPr>
@@ -14177,12 +14265,13 @@
     <w:p>
       <w:pPr>
         <w:jc w:val="left"/>
+        <w:pStyle w:val="Heading2"/>
         <w:spacing w:before="240" w:after="80" w:lineRule="auto" w:line="360"/>
       </w:pPr>
       <w:r>
         <w:rPr>
           <w:rFonts w:ascii="Times New Roman" w:hAnsi="Times New Roman" w:cs="Times New Roman" w:eastAsia="Times New Roman"/>
-          <w:b/>
+          <w:b w:val="0"/>
           <w:i w:val="0"/>
           <w:sz w:val="28"/>
         </w:rPr>
@@ -14260,12 +14349,13 @@
     <w:p>
       <w:pPr>
         <w:jc w:val="left"/>
+        <w:pStyle w:val="Heading2"/>
         <w:spacing w:before="240" w:after="80" w:lineRule="auto" w:line="360"/>
       </w:pPr>
       <w:r>
         <w:rPr>
           <w:rFonts w:ascii="Times New Roman" w:hAnsi="Times New Roman" w:cs="Times New Roman" w:eastAsia="Times New Roman"/>
-          <w:b/>
+          <w:b w:val="0"/>
           <w:i w:val="0"/>
           <w:sz w:val="28"/>
         </w:rPr>
@@ -14379,12 +14469,13 @@
     <w:p>
       <w:pPr>
         <w:jc w:val="left"/>
+        <w:pStyle w:val="Heading2"/>
         <w:spacing w:before="240" w:after="80" w:lineRule="auto" w:line="360"/>
       </w:pPr>
       <w:r>
         <w:rPr>
           <w:rFonts w:ascii="Times New Roman" w:hAnsi="Times New Roman" w:cs="Times New Roman" w:eastAsia="Times New Roman"/>
-          <w:b/>
+          <w:b w:val="0"/>
           <w:i w:val="0"/>
           <w:sz w:val="28"/>
         </w:rPr>
@@ -14444,6 +14535,7 @@
     <w:p>
       <w:pPr>
         <w:jc w:val="center"/>
+        <w:pStyle w:val="Heading1"/>
         <w:spacing w:before="320" w:after="120" w:lineRule="auto" w:line="360"/>
       </w:pPr>
       <w:r>
@@ -14459,12 +14551,13 @@
     <w:p>
       <w:pPr>
         <w:jc w:val="left"/>
+        <w:pStyle w:val="Heading2"/>
         <w:spacing w:before="240" w:after="80" w:lineRule="auto" w:line="360"/>
       </w:pPr>
       <w:r>
         <w:rPr>
           <w:rFonts w:ascii="Times New Roman" w:hAnsi="Times New Roman" w:cs="Times New Roman" w:eastAsia="Times New Roman"/>
-          <w:b/>
+          <w:b w:val="0"/>
           <w:i w:val="0"/>
           <w:sz w:val="28"/>
         </w:rPr>
@@ -14490,12 +14583,13 @@
     <w:p>
       <w:pPr>
         <w:jc w:val="left"/>
+        <w:pStyle w:val="Heading2"/>
         <w:spacing w:before="240" w:after="80" w:lineRule="auto" w:line="360"/>
       </w:pPr>
       <w:r>
         <w:rPr>
           <w:rFonts w:ascii="Times New Roman" w:hAnsi="Times New Roman" w:cs="Times New Roman" w:eastAsia="Times New Roman"/>
-          <w:b/>
+          <w:b w:val="0"/>
           <w:i w:val="0"/>
           <w:sz w:val="28"/>
         </w:rPr>
@@ -14971,12 +15065,13 @@
     <w:p>
       <w:pPr>
         <w:jc w:val="left"/>
+        <w:pStyle w:val="Heading2"/>
         <w:spacing w:before="240" w:after="80" w:lineRule="auto" w:line="360"/>
       </w:pPr>
       <w:r>
         <w:rPr>
           <w:rFonts w:ascii="Times New Roman" w:hAnsi="Times New Roman" w:cs="Times New Roman" w:eastAsia="Times New Roman"/>
-          <w:b/>
+          <w:b w:val="0"/>
           <w:i w:val="0"/>
           <w:sz w:val="28"/>
         </w:rPr>
@@ -15523,12 +15618,13 @@
     <w:p>
       <w:pPr>
         <w:jc w:val="left"/>
+        <w:pStyle w:val="Heading2"/>
         <w:spacing w:before="240" w:after="80" w:lineRule="auto" w:line="360"/>
       </w:pPr>
       <w:r>
         <w:rPr>
           <w:rFonts w:ascii="Times New Roman" w:hAnsi="Times New Roman" w:cs="Times New Roman" w:eastAsia="Times New Roman"/>
-          <w:b/>
+          <w:b w:val="0"/>
           <w:i w:val="0"/>
           <w:sz w:val="28"/>
         </w:rPr>
@@ -15602,12 +15698,13 @@
     <w:p>
       <w:pPr>
         <w:jc w:val="left"/>
+        <w:pStyle w:val="Heading2"/>
         <w:spacing w:before="240" w:after="80" w:lineRule="auto" w:line="360"/>
       </w:pPr>
       <w:r>
         <w:rPr>
           <w:rFonts w:ascii="Times New Roman" w:hAnsi="Times New Roman" w:cs="Times New Roman" w:eastAsia="Times New Roman"/>
-          <w:b/>
+          <w:b w:val="0"/>
           <w:i w:val="0"/>
           <w:sz w:val="28"/>
         </w:rPr>
@@ -16001,12 +16098,13 @@
     <w:p>
       <w:pPr>
         <w:jc w:val="left"/>
+        <w:pStyle w:val="Heading2"/>
         <w:spacing w:before="240" w:after="80" w:lineRule="auto" w:line="360"/>
       </w:pPr>
       <w:r>
         <w:rPr>
           <w:rFonts w:ascii="Times New Roman" w:hAnsi="Times New Roman" w:cs="Times New Roman" w:eastAsia="Times New Roman"/>
-          <w:b/>
+          <w:b w:val="0"/>
           <w:i w:val="0"/>
           <w:sz w:val="28"/>
         </w:rPr>
@@ -16162,6 +16260,7 @@
     <w:p>
       <w:pPr>
         <w:jc w:val="center"/>
+        <w:pStyle w:val="Heading1"/>
         <w:spacing w:before="320" w:after="120" w:lineRule="auto" w:line="360"/>
       </w:pPr>
       <w:r>
@@ -16854,6 +16953,7 @@
     <w:p>
       <w:pPr>
         <w:jc w:val="center"/>
+        <w:pStyle w:val="Heading1"/>
         <w:spacing w:before="320" w:after="120" w:lineRule="auto" w:line="360"/>
       </w:pPr>
       <w:r>

</xml_diff>

<commit_message>
Add title page and ER diagram to диплом.docx
</commit_message>
<xml_diff>
--- a/docs/диплом.docx
+++ b/docs/диплом.docx
@@ -2,6 +2,182 @@
 <file path=word/document.xml><?xml version="1.0" encoding="utf-8"?>
 <w:document xmlns:wpc="http://schemas.microsoft.com/office/word/2010/wordprocessingCanvas" xmlns:mo="http://schemas.microsoft.com/office/mac/office/2008/main" xmlns:mc="http://schemas.openxmlformats.org/markup-compatibility/2006" xmlns:mv="urn:schemas-microsoft-com:mac:vml" xmlns:o="urn:schemas-microsoft-com:office:office" xmlns:r="http://schemas.openxmlformats.org/officeDocument/2006/relationships" xmlns:m="http://schemas.openxmlformats.org/officeDocument/2006/math" xmlns:v="urn:schemas-microsoft-com:vml" xmlns:wp14="http://schemas.microsoft.com/office/word/2010/wordprocessingDrawing" xmlns:wp="http://schemas.openxmlformats.org/drawingml/2006/wordprocessingDrawing" xmlns:w10="urn:schemas-microsoft-com:office:word" xmlns:w="http://schemas.openxmlformats.org/wordprocessingml/2006/main" xmlns:w14="http://schemas.microsoft.com/office/word/2010/wordml" xmlns:wpg="http://schemas.microsoft.com/office/word/2010/wordprocessingGroup" xmlns:wpi="http://schemas.microsoft.com/office/word/2010/wordprocessingInk" xmlns:wne="http://schemas.microsoft.com/office/word/2006/wordml" xmlns:wps="http://schemas.microsoft.com/office/word/2010/wordprocessingShape" mc:Ignorable="w14 wp14">
   <w:body>
+    <w:p>
+      <w:pPr>
+        <w:spacing w:before="0" w:after="80"/>
+        <w:ind w:firstLine="0"/>
+        <w:jc w:val="center"/>
+      </w:pPr>
+      <w:r>
+        <w:rPr>
+          <w:rFonts w:ascii="Times New Roman" w:hAnsi="Times New Roman"/>
+          <w:b w:val="0"/>
+          <w:sz w:val="28"/>
+        </w:rPr>
+        <w:t>Московский университет имени С. Ю. Витте</w:t>
+      </w:r>
+    </w:p>
+    <w:p>
+      <w:pPr>
+        <w:spacing w:before="0" w:after="800"/>
+        <w:ind w:firstLine="0"/>
+        <w:jc w:val="center"/>
+      </w:pPr>
+      <w:r>
+        <w:rPr>
+          <w:rFonts w:ascii="Times New Roman" w:hAnsi="Times New Roman"/>
+          <w:b w:val="0"/>
+          <w:sz w:val="28"/>
+        </w:rPr>
+        <w:t>Кафедра информационных технологий</w:t>
+      </w:r>
+    </w:p>
+    <w:p>
+      <w:pPr>
+        <w:spacing w:before="0" w:after="400"/>
+        <w:ind w:firstLine="0"/>
+        <w:jc w:val="center"/>
+      </w:pPr>
+      <w:r>
+        <w:rPr>
+          <w:rFonts w:ascii="Times New Roman" w:hAnsi="Times New Roman"/>
+          <w:b/>
+          <w:sz w:val="32"/>
+        </w:rPr>
+        <w:t>ВЫПУСКНАЯ КВАЛИФИКАЦИОННАЯ РАБОТА</w:t>
+      </w:r>
+    </w:p>
+    <w:p>
+      <w:pPr>
+        <w:spacing w:before="0" w:after="800"/>
+        <w:ind w:firstLine="0"/>
+        <w:jc w:val="center"/>
+      </w:pPr>
+      <w:r>
+        <w:rPr>
+          <w:rFonts w:ascii="Times New Roman" w:hAnsi="Times New Roman"/>
+          <w:b w:val="0"/>
+          <w:sz w:val="28"/>
+        </w:rPr>
+        <w:t>по направлению 38.03.05 «Бизнес-информатика»</w:t>
+      </w:r>
+    </w:p>
+    <w:p>
+      <w:pPr>
+        <w:spacing w:before="0" w:after="120"/>
+        <w:ind w:firstLine="0"/>
+        <w:jc w:val="center"/>
+      </w:pPr>
+      <w:r>
+        <w:rPr>
+          <w:rFonts w:ascii="Times New Roman" w:hAnsi="Times New Roman"/>
+          <w:b w:val="0"/>
+          <w:sz w:val="28"/>
+        </w:rPr>
+        <w:t>на тему:</w:t>
+      </w:r>
+    </w:p>
+    <w:p>
+      <w:pPr>
+        <w:spacing w:before="0" w:after="1200"/>
+        <w:ind w:firstLine="0"/>
+        <w:jc w:val="center"/>
+      </w:pPr>
+      <w:r>
+        <w:rPr>
+          <w:rFonts w:ascii="Times New Roman" w:hAnsi="Times New Roman"/>
+          <w:b/>
+          <w:sz w:val="32"/>
+        </w:rPr>
+        <w:t>«Визуализация науки на основе метаданных</w:t>
+        <w:br/>
+        <w:t>публикаций и журналов»</w:t>
+      </w:r>
+    </w:p>
+    <w:p>
+      <w:pPr>
+        <w:spacing w:after="80"/>
+        <w:ind w:firstLine="0" w:left="4535"/>
+      </w:pPr>
+      <w:r>
+        <w:rPr>
+          <w:rFonts w:ascii="Times New Roman" w:hAnsi="Times New Roman"/>
+          <w:b/>
+          <w:sz w:val="28"/>
+        </w:rPr>
+        <w:t xml:space="preserve">Студент: </w:t>
+      </w:r>
+      <w:r>
+        <w:rPr>
+          <w:rFonts w:ascii="Times New Roman" w:hAnsi="Times New Roman"/>
+          <w:sz w:val="28"/>
+        </w:rPr>
+        <w:t>Сурнова Варвара Сергеевна</w:t>
+      </w:r>
+    </w:p>
+    <w:p>
+      <w:pPr>
+        <w:spacing w:after="80"/>
+        <w:ind w:firstLine="0" w:left="4535"/>
+      </w:pPr>
+      <w:r>
+        <w:rPr>
+          <w:rFonts w:ascii="Times New Roman" w:hAnsi="Times New Roman"/>
+          <w:b/>
+          <w:sz w:val="28"/>
+        </w:rPr>
+        <w:t xml:space="preserve">Группа: </w:t>
+      </w:r>
+      <w:r>
+        <w:rPr>
+          <w:rFonts w:ascii="Times New Roman" w:hAnsi="Times New Roman"/>
+          <w:sz w:val="28"/>
+        </w:rPr>
+        <w:t>ИД 30.1/Б-22</w:t>
+      </w:r>
+    </w:p>
+    <w:p/>
+    <w:p>
+      <w:pPr>
+        <w:spacing w:after="80"/>
+        <w:ind w:firstLine="0" w:left="4535"/>
+      </w:pPr>
+      <w:r>
+        <w:rPr>
+          <w:rFonts w:ascii="Times New Roman" w:hAnsi="Times New Roman"/>
+          <w:b/>
+          <w:sz w:val="28"/>
+        </w:rPr>
+        <w:t xml:space="preserve">Научный руководитель: </w:t>
+      </w:r>
+      <w:r>
+        <w:rPr>
+          <w:rFonts w:ascii="Times New Roman" w:hAnsi="Times New Roman"/>
+          <w:sz w:val="28"/>
+        </w:rPr>
+        <w:t>Атаева Ольга Муратовна</w:t>
+      </w:r>
+    </w:p>
+    <w:p>
+      <w:pPr>
+        <w:spacing w:before="1200" w:after="0"/>
+        <w:ind w:firstLine="0"/>
+        <w:jc w:val="center"/>
+      </w:pPr>
+      <w:r>
+        <w:rPr>
+          <w:rFonts w:ascii="Times New Roman" w:hAnsi="Times New Roman"/>
+          <w:b w:val="0"/>
+          <w:sz w:val="28"/>
+        </w:rPr>
+        <w:t>Москва — 2026</w:t>
+      </w:r>
+    </w:p>
+    <w:p>
+      <w:r>
+        <w:br w:type="page"/>
+      </w:r>
+    </w:p>
     <w:p>
       <w:pPr>
         <w:spacing w:before="240" w:after="120"/>
@@ -7870,18 +8046,58 @@
     </w:p>
     <w:p>
       <w:pPr>
-        <w:spacing w:before="120" w:after="120"/>
+        <w:spacing w:before="200" w:after="120"/>
         <w:ind w:firstLine="0"/>
         <w:jc w:val="center"/>
       </w:pPr>
       <w:r>
         <w:rPr>
           <w:rFonts w:ascii="Times New Roman" w:hAnsi="Times New Roman"/>
-          <w:i/>
-          <w:color w:val="888888"/>
+          <w:b/>
           <w:sz w:val="24"/>
         </w:rPr>
         <w:t>Рисунок 3 — ER-диаграмма базы данных</w:t>
+      </w:r>
+    </w:p>
+    <w:p>
+      <w:pPr>
+        <w:spacing w:after="200"/>
+        <w:ind w:firstLine="0"/>
+        <w:jc w:val="center"/>
+      </w:pPr>
+      <w:r>
+        <w:drawing>
+          <wp:inline xmlns:a="http://schemas.openxmlformats.org/drawingml/2006/main" xmlns:pic="http://schemas.openxmlformats.org/drawingml/2006/picture">
+            <wp:extent cx="5760000" cy="8142915"/>
+            <wp:docPr id="1" name="Picture 1"/>
+            <wp:cNvGraphicFramePr>
+              <a:graphicFrameLocks noChangeAspect="1"/>
+            </wp:cNvGraphicFramePr>
+            <a:graphic>
+              <a:graphicData uri="http://schemas.openxmlformats.org/drawingml/2006/picture">
+                <pic:pic>
+                  <pic:nvPicPr>
+                    <pic:cNvPr id="0" name="er_diagram.png"/>
+                    <pic:cNvPicPr/>
+                  </pic:nvPicPr>
+                  <pic:blipFill>
+                    <a:blip r:embed="rId9"/>
+                    <a:stretch>
+                      <a:fillRect/>
+                    </a:stretch>
+                  </pic:blipFill>
+                  <pic:spPr>
+                    <a:xfrm>
+                      <a:off x="0" y="0"/>
+                      <a:ext cx="5760000" cy="8142915"/>
+                    </a:xfrm>
+                    <a:prstGeom prst="rect"/>
+                  </pic:spPr>
+                </pic:pic>
+              </a:graphicData>
+            </a:graphic>
+          </wp:inline>
+        </w:drawing>
       </w:r>
     </w:p>
     <w:tbl>

</xml_diff>

<commit_message>
Add architecture and flowchart diagrams to diploma document
</commit_message>
<xml_diff>
--- a/docs/диплом.docx
+++ b/docs/диплом.docx
@@ -6484,6 +6484,45 @@
     </w:p>
     <w:p>
       <w:pPr>
+        <w:jc w:val="center"/>
+      </w:pPr>
+      <w:r>
+        <w:drawing>
+          <wp:inline xmlns:a="http://schemas.openxmlformats.org/drawingml/2006/main" xmlns:pic="http://schemas.openxmlformats.org/drawingml/2006/picture">
+            <wp:extent cx="5040000" cy="2919529"/>
+            <wp:docPr id="1" name="Picture 1"/>
+            <wp:cNvGraphicFramePr>
+              <a:graphicFrameLocks noChangeAspect="1"/>
+            </wp:cNvGraphicFramePr>
+            <a:graphic>
+              <a:graphicData uri="http://schemas.openxmlformats.org/drawingml/2006/picture">
+                <pic:pic>
+                  <pic:nvPicPr>
+                    <pic:cNvPr id="0" name="fig1_architecture.png"/>
+                    <pic:cNvPicPr/>
+                  </pic:nvPicPr>
+                  <pic:blipFill>
+                    <a:blip r:embed="rId9"/>
+                    <a:stretch>
+                      <a:fillRect/>
+                    </a:stretch>
+                  </pic:blipFill>
+                  <pic:spPr>
+                    <a:xfrm>
+                      <a:off x="0" y="0"/>
+                      <a:ext cx="5040000" cy="2919529"/>
+                    </a:xfrm>
+                    <a:prstGeom prst="rect"/>
+                  </pic:spPr>
+                </pic:pic>
+              </a:graphicData>
+            </a:graphic>
+          </wp:inline>
+        </w:drawing>
+      </w:r>
+    </w:p>
+    <w:p>
+      <w:pPr>
         <w:spacing w:before="120" w:after="120"/>
         <w:ind w:firstLine="0"/>
         <w:jc w:val="center"/>
@@ -7395,6 +7434,45 @@
           <w:sz w:val="28"/>
         </w:rPr>
         <w:t>Взаимодействие модулей системы показано на рисунке 2.</w:t>
+      </w:r>
+    </w:p>
+    <w:p>
+      <w:pPr>
+        <w:jc w:val="center"/>
+      </w:pPr>
+      <w:r>
+        <w:drawing>
+          <wp:inline xmlns:a="http://schemas.openxmlformats.org/drawingml/2006/main" xmlns:pic="http://schemas.openxmlformats.org/drawingml/2006/picture">
+            <wp:extent cx="5040000" cy="3649761"/>
+            <wp:docPr id="1" name="Picture 1"/>
+            <wp:cNvGraphicFramePr>
+              <a:graphicFrameLocks noChangeAspect="1"/>
+            </wp:cNvGraphicFramePr>
+            <a:graphic>
+              <a:graphicData uri="http://schemas.openxmlformats.org/drawingml/2006/picture">
+                <pic:pic>
+                  <pic:nvPicPr>
+                    <pic:cNvPr id="0" name="fig2_dataflow.png"/>
+                    <pic:cNvPicPr/>
+                  </pic:nvPicPr>
+                  <pic:blipFill>
+                    <a:blip r:embed="rId9"/>
+                    <a:stretch>
+                      <a:fillRect/>
+                    </a:stretch>
+                  </pic:blipFill>
+                  <pic:spPr>
+                    <a:xfrm>
+                      <a:off x="0" y="0"/>
+                      <a:ext cx="5040000" cy="3649761"/>
+                    </a:xfrm>
+                    <a:prstGeom prst="rect"/>
+                  </pic:spPr>
+                </pic:pic>
+              </a:graphicData>
+            </a:graphic>
+          </wp:inline>
+        </w:drawing>
       </w:r>
     </w:p>
     <w:p>
@@ -9718,6 +9796,45 @@
     </w:p>
     <w:p>
       <w:pPr>
+        <w:jc w:val="center"/>
+      </w:pPr>
+      <w:r>
+        <w:drawing>
+          <wp:inline xmlns:a="http://schemas.openxmlformats.org/drawingml/2006/main" xmlns:pic="http://schemas.openxmlformats.org/drawingml/2006/picture">
+            <wp:extent cx="5040000" cy="5036606"/>
+            <wp:docPr id="1" name="Picture 1"/>
+            <wp:cNvGraphicFramePr>
+              <a:graphicFrameLocks noChangeAspect="1"/>
+            </wp:cNvGraphicFramePr>
+            <a:graphic>
+              <a:graphicData uri="http://schemas.openxmlformats.org/drawingml/2006/picture">
+                <pic:pic>
+                  <pic:nvPicPr>
+                    <pic:cNvPr id="0" name="fig4_dbload.png"/>
+                    <pic:cNvPicPr/>
+                  </pic:nvPicPr>
+                  <pic:blipFill>
+                    <a:blip r:embed="rId9"/>
+                    <a:stretch>
+                      <a:fillRect/>
+                    </a:stretch>
+                  </pic:blipFill>
+                  <pic:spPr>
+                    <a:xfrm>
+                      <a:off x="0" y="0"/>
+                      <a:ext cx="5040000" cy="5036606"/>
+                    </a:xfrm>
+                    <a:prstGeom prst="rect"/>
+                  </pic:spPr>
+                </pic:pic>
+              </a:graphicData>
+            </a:graphic>
+          </wp:inline>
+        </w:drawing>
+      </w:r>
+    </w:p>
+    <w:p>
+      <w:pPr>
         <w:spacing w:before="120" w:after="120"/>
         <w:ind w:firstLine="0"/>
         <w:jc w:val="center"/>
@@ -10255,6 +10372,45 @@
           <w:sz w:val="28"/>
         </w:rPr>
         <w:t>Алгоритм геокодирования показан на рисунке 5.</w:t>
+      </w:r>
+    </w:p>
+    <w:p>
+      <w:pPr>
+        <w:jc w:val="center"/>
+      </w:pPr>
+      <w:r>
+        <w:drawing>
+          <wp:inline xmlns:a="http://schemas.openxmlformats.org/drawingml/2006/main" xmlns:pic="http://schemas.openxmlformats.org/drawingml/2006/picture">
+            <wp:extent cx="5040000" cy="4112146"/>
+            <wp:docPr id="1" name="Picture 1"/>
+            <wp:cNvGraphicFramePr>
+              <a:graphicFrameLocks noChangeAspect="1"/>
+            </wp:cNvGraphicFramePr>
+            <a:graphic>
+              <a:graphicData uri="http://schemas.openxmlformats.org/drawingml/2006/picture">
+                <pic:pic>
+                  <pic:nvPicPr>
+                    <pic:cNvPr id="0" name="fig5_geocoding.png"/>
+                    <pic:cNvPicPr/>
+                  </pic:nvPicPr>
+                  <pic:blipFill>
+                    <a:blip r:embed="rId9"/>
+                    <a:stretch>
+                      <a:fillRect/>
+                    </a:stretch>
+                  </pic:blipFill>
+                  <pic:spPr>
+                    <a:xfrm>
+                      <a:off x="0" y="0"/>
+                      <a:ext cx="5040000" cy="4112146"/>
+                    </a:xfrm>
+                    <a:prstGeom prst="rect"/>
+                  </pic:spPr>
+                </pic:pic>
+              </a:graphicData>
+            </a:graphic>
+          </wp:inline>
+        </w:drawing>
       </w:r>
     </w:p>
     <w:p>

</xml_diff>

<commit_message>
Remove titles from diagram images in diploma document
</commit_message>
<xml_diff>
--- a/docs/диплом.docx
+++ b/docs/диплом.docx
@@ -6489,7 +6489,7 @@
       <w:r>
         <w:drawing>
           <wp:inline xmlns:a="http://schemas.openxmlformats.org/drawingml/2006/main" xmlns:pic="http://schemas.openxmlformats.org/drawingml/2006/picture">
-            <wp:extent cx="5040000" cy="2919529"/>
+            <wp:extent cx="5040000" cy="1711436"/>
             <wp:docPr id="1" name="Picture 1"/>
             <wp:cNvGraphicFramePr>
               <a:graphicFrameLocks noChangeAspect="1"/>
@@ -6510,7 +6510,7 @@
                   <pic:spPr>
                     <a:xfrm>
                       <a:off x="0" y="0"/>
-                      <a:ext cx="5040000" cy="2919529"/>
+                      <a:ext cx="5040000" cy="1711436"/>
                     </a:xfrm>
                     <a:prstGeom prst="rect"/>
                   </pic:spPr>
@@ -7443,7 +7443,7 @@
       <w:r>
         <w:drawing>
           <wp:inline xmlns:a="http://schemas.openxmlformats.org/drawingml/2006/main" xmlns:pic="http://schemas.openxmlformats.org/drawingml/2006/picture">
-            <wp:extent cx="5040000" cy="3649761"/>
+            <wp:extent cx="5040000" cy="9968292"/>
             <wp:docPr id="1" name="Picture 1"/>
             <wp:cNvGraphicFramePr>
               <a:graphicFrameLocks noChangeAspect="1"/>
@@ -7464,7 +7464,7 @@
                   <pic:spPr>
                     <a:xfrm>
                       <a:off x="0" y="0"/>
-                      <a:ext cx="5040000" cy="3649761"/>
+                      <a:ext cx="5040000" cy="9968292"/>
                     </a:xfrm>
                     <a:prstGeom prst="rect"/>
                   </pic:spPr>
@@ -9801,7 +9801,7 @@
       <w:r>
         <w:drawing>
           <wp:inline xmlns:a="http://schemas.openxmlformats.org/drawingml/2006/main" xmlns:pic="http://schemas.openxmlformats.org/drawingml/2006/picture">
-            <wp:extent cx="5040000" cy="5036606"/>
+            <wp:extent cx="5040000" cy="6903599"/>
             <wp:docPr id="1" name="Picture 1"/>
             <wp:cNvGraphicFramePr>
               <a:graphicFrameLocks noChangeAspect="1"/>
@@ -9822,7 +9822,7 @@
                   <pic:spPr>
                     <a:xfrm>
                       <a:off x="0" y="0"/>
-                      <a:ext cx="5040000" cy="5036606"/>
+                      <a:ext cx="5040000" cy="6903599"/>
                     </a:xfrm>
                     <a:prstGeom prst="rect"/>
                   </pic:spPr>
@@ -10381,7 +10381,7 @@
       <w:r>
         <w:drawing>
           <wp:inline xmlns:a="http://schemas.openxmlformats.org/drawingml/2006/main" xmlns:pic="http://schemas.openxmlformats.org/drawingml/2006/picture">
-            <wp:extent cx="5040000" cy="4112146"/>
+            <wp:extent cx="5040000" cy="4541648"/>
             <wp:docPr id="1" name="Picture 1"/>
             <wp:cNvGraphicFramePr>
               <a:graphicFrameLocks noChangeAspect="1"/>
@@ -10402,7 +10402,7 @@
                   <pic:spPr>
                     <a:xfrm>
                       <a:off x="0" y="0"/>
-                      <a:ext cx="5040000" cy="4112146"/>
+                      <a:ext cx="5040000" cy="4541648"/>
                     </a:xfrm>
                     <a:prstGeom prst="rect"/>
                   </pic:spPr>

</xml_diff>

<commit_message>
Replace ER diagram (Рис 3) with v3: fixed overlapping elements inside image
https://claude.ai/code/session_01JXZNXE9oVEv7rsUiTvXR5D
</commit_message>
<xml_diff>
--- a/docs/диплом.docx
+++ b/docs/диплом.docx
@@ -8007,8 +8007,8 @@
       <w:r>
         <w:drawing>
           <wp:inline xmlns:a="http://schemas.openxmlformats.org/drawingml/2006/main" xmlns:pic="http://schemas.openxmlformats.org/drawingml/2006/picture">
-            <wp:extent cx="4320000" cy="3095482"/>
-            <wp:docPr id="3" name="Picture 3"/>
+            <wp:extent cx="5040000" cy="3788862"/>
+            <wp:docPr id="14" name="Picture 14"/>
             <wp:cNvGraphicFramePr>
               <a:graphicFrameLocks noChangeAspect="1"/>
             </wp:cNvGraphicFramePr>
@@ -8016,11 +8016,11 @@
               <a:graphicData uri="http://schemas.openxmlformats.org/drawingml/2006/picture">
                 <pic:pic>
                   <pic:nvPicPr>
-                    <pic:cNvPr id="0" name="er_diagram_new.png"/>
+                    <pic:cNvPr id="0" name="er_diagram_v3.png"/>
                     <pic:cNvPicPr/>
                   </pic:nvPicPr>
                   <pic:blipFill>
-                    <a:blip r:embed="rId12"/>
+                    <a:blip r:embed="rId23"/>
                     <a:stretch>
                       <a:fillRect/>
                     </a:stretch>
@@ -8028,7 +8028,7 @@
                   <pic:spPr>
                     <a:xfrm>
                       <a:off x="0" y="0"/>
-                      <a:ext cx="4320000" cy="3095482"/>
+                      <a:ext cx="5040000" cy="3788862"/>
                     </a:xfrm>
                     <a:prstGeom prst="rect"/>
                   </pic:spPr>

</xml_diff>